<commit_message>
Match the DFD document to the sample's layout
Only a title line and a diagram on each portrait page, no extra text.
Users are the only external entities (codes go straight to the user),
data stores show their name only, and the Progress and Authentication
Level 1 diagrams pass data through the stores so they fit the page.

Co-Authored-By: Claude Opus 5.5 <noreply@anthropic.com>
Claude-Session: https://claude.ai/code/session_0197sgxmB7VL2gdQVtM7kWoL
</commit_message>
<xml_diff>
--- a/docs/CobraByte_Context_Diagram_and_DFD.docx
+++ b/docs/CobraByte_Context_Diagram_and_DFD.docx
@@ -3,105 +3,15 @@
 <w:document xmlns:wpc="http://schemas.microsoft.com/office/word/2010/wordprocessingCanvas" xmlns:mo="http://schemas.microsoft.com/office/mac/office/2008/main" xmlns:mc="http://schemas.openxmlformats.org/markup-compatibility/2006" xmlns:mv="urn:schemas-microsoft-com:mac:vml" xmlns:o="urn:schemas-microsoft-com:office:office" xmlns:r="http://schemas.openxmlformats.org/officeDocument/2006/relationships" xmlns:m="http://schemas.openxmlformats.org/officeDocument/2006/math" xmlns:v="urn:schemas-microsoft-com:vml" xmlns:wp14="http://schemas.microsoft.com/office/word/2010/wordprocessingDrawing" xmlns:wp="http://schemas.openxmlformats.org/drawingml/2006/wordprocessingDrawing" xmlns:w10="urn:schemas-microsoft-com:office:word" xmlns:w="http://schemas.openxmlformats.org/wordprocessingml/2006/main" xmlns:w14="http://schemas.microsoft.com/office/word/2010/wordml" xmlns:wpg="http://schemas.microsoft.com/office/word/2010/wordprocessingGroup" xmlns:wpi="http://schemas.microsoft.com/office/word/2010/wordprocessingInk" xmlns:wne="http://schemas.microsoft.com/office/word/2006/wordml" xmlns:wps="http://schemas.microsoft.com/office/word/2010/wordprocessingShape" mc:Ignorable="w14 wp14">
   <w:body>
     <w:p>
-      <w:pPr>
-        <w:pStyle w:val="Title"/>
-        <w:jc w:val="center"/>
-      </w:pPr>
       <w:r>
-        <w:t>CobraByte: Learn Python the Interactive Way</w:t>
+        <w:t>Context Diagram</w:t>
       </w:r>
     </w:p>
     <w:p>
-      <w:pPr>
-        <w:jc w:val="center"/>
-      </w:pPr>
-      <w:r>
-        <w:rPr>
-          <w:sz w:val="28"/>
-        </w:rPr>
-        <w:t>Context Diagram and Data Flow Diagrams</w:t>
-      </w:r>
-    </w:p>
-    <w:p>
-      <w:pPr>
-        <w:pStyle w:val="Heading1"/>
-      </w:pPr>
-      <w:r>
-        <w:t>Users of the System</w:t>
-      </w:r>
-    </w:p>
-    <w:p>
-      <w:pPr>
-        <w:pStyle w:val="ListBullet"/>
-      </w:pPr>
-      <w:r>
-        <w:rPr>
-          <w:b/>
-        </w:rPr>
-        <w:t xml:space="preserve">Admin – </w:t>
-      </w:r>
-      <w:r>
-        <w:t>Manages accounts, security, help requests, game settings, reports and monitoring. Can view Publishing and Preview but cannot change content.</w:t>
-      </w:r>
-    </w:p>
-    <w:p>
-      <w:pPr>
-        <w:pStyle w:val="ListBullet"/>
-      </w:pPr>
-      <w:r>
-        <w:rPr>
-          <w:b/>
-        </w:rPr>
-        <w:t xml:space="preserve">Mentor – </w:t>
-      </w:r>
-      <w:r>
-        <w:t>Creates and publishes all course content: chapters, modules, lessons, videos, learning activities, coding exercises and badges. Views learner progress and recommendations.</w:t>
-      </w:r>
-    </w:p>
-    <w:p>
-      <w:pPr>
-        <w:pStyle w:val="ListBullet"/>
-      </w:pPr>
-      <w:r>
-        <w:rPr>
-          <w:b/>
-        </w:rPr>
-        <w:t xml:space="preserve">Learner – </w:t>
-      </w:r>
-      <w:r>
-        <w:t>Signs up, works through the course (lessons, activities, coding exercises, sandbox), and earns badges and a Certificate of Completion.</w:t>
-      </w:r>
-    </w:p>
-    <w:p>
-      <w:pPr>
-        <w:pStyle w:val="ListBullet"/>
-      </w:pPr>
-      <w:r>
-        <w:rPr>
-          <w:b/>
-        </w:rPr>
-        <w:t xml:space="preserve">Email Server – </w:t>
-      </w:r>
-      <w:r>
-        <w:t>Sends the verification, password-reset and username codes.</w:t>
-      </w:r>
-    </w:p>
-    <w:p>
-      <w:pPr>
-        <w:pStyle w:val="Heading1"/>
-      </w:pPr>
-      <w:r>
-        <w:t>Legend</w:t>
-      </w:r>
-    </w:p>
-    <w:p>
-      <w:pPr>
-        <w:jc w:val="center"/>
-      </w:pPr>
       <w:r>
         <w:drawing>
           <wp:inline xmlns:a="http://schemas.openxmlformats.org/drawingml/2006/main" xmlns:pic="http://schemas.openxmlformats.org/drawingml/2006/picture">
-            <wp:extent cx="5029200" cy="844124"/>
+            <wp:extent cx="5943600" cy="3542035"/>
             <wp:docPr id="1" name="Picture 1"/>
             <wp:cNvGraphicFramePr>
               <a:graphicFrameLocks noChangeAspect="1"/>
@@ -110,7 +20,7 @@
               <a:graphicData uri="http://schemas.openxmlformats.org/drawingml/2006/picture">
                 <pic:pic>
                   <pic:nvPicPr>
-                    <pic:cNvPr id="0" name="legend.png"/>
+                    <pic:cNvPr id="0" name="context.png"/>
                     <pic:cNvPicPr/>
                   </pic:nvPicPr>
                   <pic:blipFill>
@@ -122,7 +32,7 @@
                   <pic:spPr>
                     <a:xfrm>
                       <a:off x="0" y="0"/>
-                      <a:ext cx="5029200" cy="844124"/>
+                      <a:ext cx="5943600" cy="3542035"/>
                     </a:xfrm>
                     <a:prstGeom prst="rect"/>
                   </pic:spPr>
@@ -135,1044 +45,17 @@
     </w:p>
     <w:p>
       <w:pPr>
-        <w:pStyle w:val="Heading1"/>
+        <w:pageBreakBefore/>
       </w:pPr>
       <w:r>
-        <w:t>Data Stores</w:t>
+        <w:t>DFD Level 0</w:t>
       </w:r>
     </w:p>
     <w:p>
       <w:r>
-        <w:t>Each data store in the diagrams stands for one or more tables in the CobraByte database (cobra_db).</w:t>
-      </w:r>
-    </w:p>
-    <w:tbl>
-      <w:tblPr>
-        <w:tblStyle w:val="LightGrid-Accent1"/>
-        <w:tblW w:type="auto" w:w="0"/>
-        <w:tblLook w:firstColumn="1" w:firstRow="1" w:lastColumn="0" w:lastRow="0" w:noHBand="0" w:noVBand="1" w:val="04A0"/>
-      </w:tblPr>
-      <w:tblGrid>
-        <w:gridCol w:w="3120"/>
-        <w:gridCol w:w="3120"/>
-        <w:gridCol w:w="3120"/>
-      </w:tblGrid>
-      <w:tr>
-        <w:tc>
-          <w:tcPr>
-            <w:tcW w:type="dxa" w:w="864"/>
-          </w:tcPr>
-          <w:p>
-            <w:r>
-              <w:rPr>
-                <w:sz w:val="19"/>
-              </w:rPr>
-              <w:t>No.</w:t>
-            </w:r>
-          </w:p>
-        </w:tc>
-        <w:tc>
-          <w:tcPr>
-            <w:tcW w:type="dxa" w:w="2304"/>
-          </w:tcPr>
-          <w:p>
-            <w:r>
-              <w:rPr>
-                <w:sz w:val="19"/>
-              </w:rPr>
-              <w:t>Data Store</w:t>
-            </w:r>
-          </w:p>
-        </w:tc>
-        <w:tc>
-          <w:tcPr>
-            <w:tcW w:type="dxa" w:w="6192"/>
-          </w:tcPr>
-          <w:p>
-            <w:r>
-              <w:rPr>
-                <w:sz w:val="19"/>
-              </w:rPr>
-              <w:t>Database Tables</w:t>
-            </w:r>
-          </w:p>
-        </w:tc>
-      </w:tr>
-      <w:tr>
-        <w:tc>
-          <w:tcPr>
-            <w:tcW w:type="dxa" w:w="864"/>
-          </w:tcPr>
-          <w:p>
-            <w:r>
-              <w:rPr>
-                <w:sz w:val="19"/>
-              </w:rPr>
-              <w:t>D1</w:t>
-            </w:r>
-          </w:p>
-        </w:tc>
-        <w:tc>
-          <w:tcPr>
-            <w:tcW w:type="dxa" w:w="2304"/>
-          </w:tcPr>
-          <w:p>
-            <w:r>
-              <w:rPr>
-                <w:sz w:val="19"/>
-              </w:rPr>
-              <w:t>Accounts</w:t>
-            </w:r>
-          </w:p>
-        </w:tc>
-        <w:tc>
-          <w:tcPr>
-            <w:tcW w:type="dxa" w:w="6192"/>
-          </w:tcPr>
-          <w:p>
-            <w:r>
-              <w:rPr>
-                <w:sz w:val="19"/>
-              </w:rPr>
-              <w:t>account_tbl, profile_tbl, usertype_tbl, gender_tbl</w:t>
-            </w:r>
-          </w:p>
-        </w:tc>
-      </w:tr>
-      <w:tr>
-        <w:tc>
-          <w:tcPr>
-            <w:tcW w:type="dxa" w:w="864"/>
-          </w:tcPr>
-          <w:p>
-            <w:r>
-              <w:rPr>
-                <w:sz w:val="19"/>
-              </w:rPr>
-              <w:t>D2</w:t>
-            </w:r>
-          </w:p>
-        </w:tc>
-        <w:tc>
-          <w:tcPr>
-            <w:tcW w:type="dxa" w:w="2304"/>
-          </w:tcPr>
-          <w:p>
-            <w:r>
-              <w:rPr>
-                <w:sz w:val="19"/>
-              </w:rPr>
-              <w:t>Login Logs</w:t>
-            </w:r>
-          </w:p>
-        </w:tc>
-        <w:tc>
-          <w:tcPr>
-            <w:tcW w:type="dxa" w:w="6192"/>
-          </w:tcPr>
-          <w:p>
-            <w:r>
-              <w:rPr>
-                <w:sz w:val="19"/>
-              </w:rPr>
-              <w:t>login_logs_tbl, lockout_logs_tbl, password_reset_logs_tbl, unlock_logs_tbl</w:t>
-            </w:r>
-          </w:p>
-        </w:tc>
-      </w:tr>
-      <w:tr>
-        <w:tc>
-          <w:tcPr>
-            <w:tcW w:type="dxa" w:w="864"/>
-          </w:tcPr>
-          <w:p>
-            <w:r>
-              <w:rPr>
-                <w:sz w:val="19"/>
-              </w:rPr>
-              <w:t>D3</w:t>
-            </w:r>
-          </w:p>
-        </w:tc>
-        <w:tc>
-          <w:tcPr>
-            <w:tcW w:type="dxa" w:w="2304"/>
-          </w:tcPr>
-          <w:p>
-            <w:r>
-              <w:rPr>
-                <w:sz w:val="19"/>
-              </w:rPr>
-              <w:t>Sessions</w:t>
-            </w:r>
-          </w:p>
-        </w:tc>
-        <w:tc>
-          <w:tcPr>
-            <w:tcW w:type="dxa" w:w="6192"/>
-          </w:tcPr>
-          <w:p>
-            <w:r>
-              <w:rPr>
-                <w:sz w:val="19"/>
-              </w:rPr>
-              <w:t>active_sessions_tbl, staff_presence_tbl, learner_where_tbl</w:t>
-            </w:r>
-          </w:p>
-        </w:tc>
-      </w:tr>
-      <w:tr>
-        <w:tc>
-          <w:tcPr>
-            <w:tcW w:type="dxa" w:w="864"/>
-          </w:tcPr>
-          <w:p>
-            <w:r>
-              <w:rPr>
-                <w:sz w:val="19"/>
-              </w:rPr>
-              <w:t>D4</w:t>
-            </w:r>
-          </w:p>
-        </w:tc>
-        <w:tc>
-          <w:tcPr>
-            <w:tcW w:type="dxa" w:w="2304"/>
-          </w:tcPr>
-          <w:p>
-            <w:r>
-              <w:rPr>
-                <w:sz w:val="19"/>
-              </w:rPr>
-              <w:t>Consent</w:t>
-            </w:r>
-          </w:p>
-        </w:tc>
-        <w:tc>
-          <w:tcPr>
-            <w:tcW w:type="dxa" w:w="6192"/>
-          </w:tcPr>
-          <w:p>
-            <w:r>
-              <w:rPr>
-                <w:sz w:val="19"/>
-              </w:rPr>
-              <w:t>consent_tbl</w:t>
-            </w:r>
-          </w:p>
-        </w:tc>
-      </w:tr>
-      <w:tr>
-        <w:tc>
-          <w:tcPr>
-            <w:tcW w:type="dxa" w:w="864"/>
-          </w:tcPr>
-          <w:p>
-            <w:r>
-              <w:rPr>
-                <w:sz w:val="19"/>
-              </w:rPr>
-              <w:t>D5</w:t>
-            </w:r>
-          </w:p>
-        </w:tc>
-        <w:tc>
-          <w:tcPr>
-            <w:tcW w:type="dxa" w:w="2304"/>
-          </w:tcPr>
-          <w:p>
-            <w:r>
-              <w:rPr>
-                <w:sz w:val="19"/>
-              </w:rPr>
-              <w:t>Chapters</w:t>
-            </w:r>
-          </w:p>
-        </w:tc>
-        <w:tc>
-          <w:tcPr>
-            <w:tcW w:type="dxa" w:w="6192"/>
-          </w:tcPr>
-          <w:p>
-            <w:r>
-              <w:rPr>
-                <w:sz w:val="19"/>
-              </w:rPr>
-              <w:t>category_tbl, category_stats_tbl</w:t>
-            </w:r>
-          </w:p>
-        </w:tc>
-      </w:tr>
-      <w:tr>
-        <w:tc>
-          <w:tcPr>
-            <w:tcW w:type="dxa" w:w="864"/>
-          </w:tcPr>
-          <w:p>
-            <w:r>
-              <w:rPr>
-                <w:sz w:val="19"/>
-              </w:rPr>
-              <w:t>D6</w:t>
-            </w:r>
-          </w:p>
-        </w:tc>
-        <w:tc>
-          <w:tcPr>
-            <w:tcW w:type="dxa" w:w="2304"/>
-          </w:tcPr>
-          <w:p>
-            <w:r>
-              <w:rPr>
-                <w:sz w:val="19"/>
-              </w:rPr>
-              <w:t>Modules</w:t>
-            </w:r>
-          </w:p>
-        </w:tc>
-        <w:tc>
-          <w:tcPr>
-            <w:tcW w:type="dxa" w:w="6192"/>
-          </w:tcPr>
-          <w:p>
-            <w:r>
-              <w:rPr>
-                <w:sz w:val="19"/>
-              </w:rPr>
-              <w:t>modules_tbl, module_stats_tbl</w:t>
-            </w:r>
-          </w:p>
-        </w:tc>
-      </w:tr>
-      <w:tr>
-        <w:tc>
-          <w:tcPr>
-            <w:tcW w:type="dxa" w:w="864"/>
-          </w:tcPr>
-          <w:p>
-            <w:r>
-              <w:rPr>
-                <w:sz w:val="19"/>
-              </w:rPr>
-              <w:t>D7</w:t>
-            </w:r>
-          </w:p>
-        </w:tc>
-        <w:tc>
-          <w:tcPr>
-            <w:tcW w:type="dxa" w:w="2304"/>
-          </w:tcPr>
-          <w:p>
-            <w:r>
-              <w:rPr>
-                <w:sz w:val="19"/>
-              </w:rPr>
-              <w:t>Lessons</w:t>
-            </w:r>
-          </w:p>
-        </w:tc>
-        <w:tc>
-          <w:tcPr>
-            <w:tcW w:type="dxa" w:w="6192"/>
-          </w:tcPr>
-          <w:p>
-            <w:r>
-              <w:rPr>
-                <w:sz w:val="19"/>
-              </w:rPr>
-              <w:t>learning_resources_tbl, lesson_content_tbl, resource_types_tbl, learning_resources_stats_tbl, uploaded_images_tbl</w:t>
-            </w:r>
-          </w:p>
-        </w:tc>
-      </w:tr>
-      <w:tr>
-        <w:tc>
-          <w:tcPr>
-            <w:tcW w:type="dxa" w:w="864"/>
-          </w:tcPr>
-          <w:p>
-            <w:r>
-              <w:rPr>
-                <w:sz w:val="19"/>
-              </w:rPr>
-              <w:t>D8</w:t>
-            </w:r>
-          </w:p>
-        </w:tc>
-        <w:tc>
-          <w:tcPr>
-            <w:tcW w:type="dxa" w:w="2304"/>
-          </w:tcPr>
-          <w:p>
-            <w:r>
-              <w:rPr>
-                <w:sz w:val="19"/>
-              </w:rPr>
-              <w:t>Video Tutorials</w:t>
-            </w:r>
-          </w:p>
-        </w:tc>
-        <w:tc>
-          <w:tcPr>
-            <w:tcW w:type="dxa" w:w="6192"/>
-          </w:tcPr>
-          <w:p>
-            <w:r>
-              <w:rPr>
-                <w:sz w:val="19"/>
-              </w:rPr>
-              <w:t>video_tutorials_tbl</w:t>
-            </w:r>
-          </w:p>
-        </w:tc>
-      </w:tr>
-      <w:tr>
-        <w:tc>
-          <w:tcPr>
-            <w:tcW w:type="dxa" w:w="864"/>
-          </w:tcPr>
-          <w:p>
-            <w:r>
-              <w:rPr>
-                <w:sz w:val="19"/>
-              </w:rPr>
-              <w:t>D9</w:t>
-            </w:r>
-          </w:p>
-        </w:tc>
-        <w:tc>
-          <w:tcPr>
-            <w:tcW w:type="dxa" w:w="2304"/>
-          </w:tcPr>
-          <w:p>
-            <w:r>
-              <w:rPr>
-                <w:sz w:val="19"/>
-              </w:rPr>
-              <w:t>Learning Activities</w:t>
-            </w:r>
-          </w:p>
-        </w:tc>
-        <w:tc>
-          <w:tcPr>
-            <w:tcW w:type="dxa" w:w="6192"/>
-          </w:tcPr>
-          <w:p>
-            <w:r>
-              <w:rPr>
-                <w:sz w:val="19"/>
-              </w:rPr>
-              <w:t>learning_activities_tbl, activity_types_tbl, learning_activities_stats_tbl, mcq_questions_tbl, mcq_options_tbl, fill_blanks_tbl, flashcards_tbl</w:t>
-            </w:r>
-          </w:p>
-        </w:tc>
-      </w:tr>
-      <w:tr>
-        <w:tc>
-          <w:tcPr>
-            <w:tcW w:type="dxa" w:w="864"/>
-          </w:tcPr>
-          <w:p>
-            <w:r>
-              <w:rPr>
-                <w:sz w:val="19"/>
-              </w:rPr>
-              <w:t>D10</w:t>
-            </w:r>
-          </w:p>
-        </w:tc>
-        <w:tc>
-          <w:tcPr>
-            <w:tcW w:type="dxa" w:w="2304"/>
-          </w:tcPr>
-          <w:p>
-            <w:r>
-              <w:rPr>
-                <w:sz w:val="19"/>
-              </w:rPr>
-              <w:t>Coding Exercises</w:t>
-            </w:r>
-          </w:p>
-        </w:tc>
-        <w:tc>
-          <w:tcPr>
-            <w:tcW w:type="dxa" w:w="6192"/>
-          </w:tcPr>
-          <w:p>
-            <w:r>
-              <w:rPr>
-                <w:sz w:val="19"/>
-              </w:rPr>
-              <w:t>coding_exercises_tbl, test_cases_tbl, exercise_required_tags_tbl</w:t>
-            </w:r>
-          </w:p>
-        </w:tc>
-      </w:tr>
-      <w:tr>
-        <w:tc>
-          <w:tcPr>
-            <w:tcW w:type="dxa" w:w="864"/>
-          </w:tcPr>
-          <w:p>
-            <w:r>
-              <w:rPr>
-                <w:sz w:val="19"/>
-              </w:rPr>
-              <w:t>D11</w:t>
-            </w:r>
-          </w:p>
-        </w:tc>
-        <w:tc>
-          <w:tcPr>
-            <w:tcW w:type="dxa" w:w="2304"/>
-          </w:tcPr>
-          <w:p>
-            <w:r>
-              <w:rPr>
-                <w:sz w:val="19"/>
-              </w:rPr>
-              <w:t>Learner Answers</w:t>
-            </w:r>
-          </w:p>
-        </w:tc>
-        <w:tc>
-          <w:tcPr>
-            <w:tcW w:type="dxa" w:w="6192"/>
-          </w:tcPr>
-          <w:p>
-            <w:r>
-              <w:rPr>
-                <w:sz w:val="19"/>
-              </w:rPr>
-              <w:t>activity_plays_tbl, activity_play_items_tbl, mcq_activity_sessions_tbl, mcq_learner_answers_tbl, fib_learner_answers_tbl, flashcard_activity_sessions_tbl, flashcard_learner_answers_tbl, activity_retakes_tbl, activity_leave_logs_tbl</w:t>
-            </w:r>
-          </w:p>
-        </w:tc>
-      </w:tr>
-      <w:tr>
-        <w:tc>
-          <w:tcPr>
-            <w:tcW w:type="dxa" w:w="864"/>
-          </w:tcPr>
-          <w:p>
-            <w:r>
-              <w:rPr>
-                <w:sz w:val="19"/>
-              </w:rPr>
-              <w:t>D12</w:t>
-            </w:r>
-          </w:p>
-        </w:tc>
-        <w:tc>
-          <w:tcPr>
-            <w:tcW w:type="dxa" w:w="2304"/>
-          </w:tcPr>
-          <w:p>
-            <w:r>
-              <w:rPr>
-                <w:sz w:val="19"/>
-              </w:rPr>
-              <w:t>Exercise Submissions</w:t>
-            </w:r>
-          </w:p>
-        </w:tc>
-        <w:tc>
-          <w:tcPr>
-            <w:tcW w:type="dxa" w:w="6192"/>
-          </w:tcPr>
-          <w:p>
-            <w:r>
-              <w:rPr>
-                <w:sz w:val="19"/>
-              </w:rPr>
-              <w:t>exercise_submissions_tbl, learner_exercise_draws_tbl</w:t>
-            </w:r>
-          </w:p>
-        </w:tc>
-      </w:tr>
-      <w:tr>
-        <w:tc>
-          <w:tcPr>
-            <w:tcW w:type="dxa" w:w="864"/>
-          </w:tcPr>
-          <w:p>
-            <w:r>
-              <w:rPr>
-                <w:sz w:val="19"/>
-              </w:rPr>
-              <w:t>D13</w:t>
-            </w:r>
-          </w:p>
-        </w:tc>
-        <w:tc>
-          <w:tcPr>
-            <w:tcW w:type="dxa" w:w="2304"/>
-          </w:tcPr>
-          <w:p>
-            <w:r>
-              <w:rPr>
-                <w:sz w:val="19"/>
-              </w:rPr>
-              <w:t>Learner Progress</w:t>
-            </w:r>
-          </w:p>
-        </w:tc>
-        <w:tc>
-          <w:tcPr>
-            <w:tcW w:type="dxa" w:w="6192"/>
-          </w:tcPr>
-          <w:p>
-            <w:r>
-              <w:rPr>
-                <w:sz w:val="19"/>
-              </w:rPr>
-              <w:t>learner_resource_progress_tbl, learner_activity_progress_tbl, learner_exercise_progress_tbl, learner_progress_unlocks_tbl, learner_chapter_skips_tbl, learner_lives_tbl, fib_learner_lives_tbl, learner_time_tbl, learner_tour_tbl</w:t>
-            </w:r>
-          </w:p>
-        </w:tc>
-      </w:tr>
-      <w:tr>
-        <w:tc>
-          <w:tcPr>
-            <w:tcW w:type="dxa" w:w="864"/>
-          </w:tcPr>
-          <w:p>
-            <w:r>
-              <w:rPr>
-                <w:sz w:val="19"/>
-              </w:rPr>
-              <w:t>D14</w:t>
-            </w:r>
-          </w:p>
-        </w:tc>
-        <w:tc>
-          <w:tcPr>
-            <w:tcW w:type="dxa" w:w="2304"/>
-          </w:tcPr>
-          <w:p>
-            <w:r>
-              <w:rPr>
-                <w:sz w:val="19"/>
-              </w:rPr>
-              <w:t>Badges</w:t>
-            </w:r>
-          </w:p>
-        </w:tc>
-        <w:tc>
-          <w:tcPr>
-            <w:tcW w:type="dxa" w:w="6192"/>
-          </w:tcPr>
-          <w:p>
-            <w:r>
-              <w:rPr>
-                <w:sz w:val="19"/>
-              </w:rPr>
-              <w:t>badges_tbl, learner_badges_tbl</w:t>
-            </w:r>
-          </w:p>
-        </w:tc>
-      </w:tr>
-      <w:tr>
-        <w:tc>
-          <w:tcPr>
-            <w:tcW w:type="dxa" w:w="864"/>
-          </w:tcPr>
-          <w:p>
-            <w:r>
-              <w:rPr>
-                <w:sz w:val="19"/>
-              </w:rPr>
-              <w:t>D15</w:t>
-            </w:r>
-          </w:p>
-        </w:tc>
-        <w:tc>
-          <w:tcPr>
-            <w:tcW w:type="dxa" w:w="2304"/>
-          </w:tcPr>
-          <w:p>
-            <w:r>
-              <w:rPr>
-                <w:sz w:val="19"/>
-              </w:rPr>
-              <w:t>Certificates</w:t>
-            </w:r>
-          </w:p>
-        </w:tc>
-        <w:tc>
-          <w:tcPr>
-            <w:tcW w:type="dxa" w:w="6192"/>
-          </w:tcPr>
-          <w:p>
-            <w:r>
-              <w:rPr>
-                <w:sz w:val="19"/>
-              </w:rPr>
-              <w:t>certificates_tbl</w:t>
-            </w:r>
-          </w:p>
-        </w:tc>
-      </w:tr>
-      <w:tr>
-        <w:tc>
-          <w:tcPr>
-            <w:tcW w:type="dxa" w:w="864"/>
-          </w:tcPr>
-          <w:p>
-            <w:r>
-              <w:rPr>
-                <w:sz w:val="19"/>
-              </w:rPr>
-              <w:t>D16</w:t>
-            </w:r>
-          </w:p>
-        </w:tc>
-        <w:tc>
-          <w:tcPr>
-            <w:tcW w:type="dxa" w:w="2304"/>
-          </w:tcPr>
-          <w:p>
-            <w:r>
-              <w:rPr>
-                <w:sz w:val="19"/>
-              </w:rPr>
-              <w:t>Recommendations</w:t>
-            </w:r>
-          </w:p>
-        </w:tc>
-        <w:tc>
-          <w:tcPr>
-            <w:tcW w:type="dxa" w:w="6192"/>
-          </w:tcPr>
-          <w:p>
-            <w:r>
-              <w:rPr>
-                <w:sz w:val="19"/>
-              </w:rPr>
-              <w:t>lesson_recommendations_tbl</w:t>
-            </w:r>
-          </w:p>
-        </w:tc>
-      </w:tr>
-      <w:tr>
-        <w:tc>
-          <w:tcPr>
-            <w:tcW w:type="dxa" w:w="864"/>
-          </w:tcPr>
-          <w:p>
-            <w:r>
-              <w:rPr>
-                <w:sz w:val="19"/>
-              </w:rPr>
-              <w:t>D17</w:t>
-            </w:r>
-          </w:p>
-        </w:tc>
-        <w:tc>
-          <w:tcPr>
-            <w:tcW w:type="dxa" w:w="2304"/>
-          </w:tcPr>
-          <w:p>
-            <w:r>
-              <w:rPr>
-                <w:sz w:val="19"/>
-              </w:rPr>
-              <w:t>Notifications</w:t>
-            </w:r>
-          </w:p>
-        </w:tc>
-        <w:tc>
-          <w:tcPr>
-            <w:tcW w:type="dxa" w:w="6192"/>
-          </w:tcPr>
-          <w:p>
-            <w:r>
-              <w:rPr>
-                <w:sz w:val="19"/>
-              </w:rPr>
-              <w:t>notifications_tbl</w:t>
-            </w:r>
-          </w:p>
-        </w:tc>
-      </w:tr>
-      <w:tr>
-        <w:tc>
-          <w:tcPr>
-            <w:tcW w:type="dxa" w:w="864"/>
-          </w:tcPr>
-          <w:p>
-            <w:r>
-              <w:rPr>
-                <w:sz w:val="19"/>
-              </w:rPr>
-              <w:t>D18</w:t>
-            </w:r>
-          </w:p>
-        </w:tc>
-        <w:tc>
-          <w:tcPr>
-            <w:tcW w:type="dxa" w:w="2304"/>
-          </w:tcPr>
-          <w:p>
-            <w:r>
-              <w:rPr>
-                <w:sz w:val="19"/>
-              </w:rPr>
-              <w:t>Coding Sandbox</w:t>
-            </w:r>
-          </w:p>
-        </w:tc>
-        <w:tc>
-          <w:tcPr>
-            <w:tcW w:type="dxa" w:w="6192"/>
-          </w:tcPr>
-          <w:p>
-            <w:r>
-              <w:rPr>
-                <w:sz w:val="19"/>
-              </w:rPr>
-              <w:t>sandbox_runs_tbl, sandbox_snippets_tbl</w:t>
-            </w:r>
-          </w:p>
-        </w:tc>
-      </w:tr>
-      <w:tr>
-        <w:tc>
-          <w:tcPr>
-            <w:tcW w:type="dxa" w:w="864"/>
-          </w:tcPr>
-          <w:p>
-            <w:r>
-              <w:rPr>
-                <w:sz w:val="19"/>
-              </w:rPr>
-              <w:t>D19</w:t>
-            </w:r>
-          </w:p>
-        </w:tc>
-        <w:tc>
-          <w:tcPr>
-            <w:tcW w:type="dxa" w:w="2304"/>
-          </w:tcPr>
-          <w:p>
-            <w:r>
-              <w:rPr>
-                <w:sz w:val="19"/>
-              </w:rPr>
-              <w:t>Help Requests</w:t>
-            </w:r>
-          </w:p>
-        </w:tc>
-        <w:tc>
-          <w:tcPr>
-            <w:tcW w:type="dxa" w:w="6192"/>
-          </w:tcPr>
-          <w:p>
-            <w:r>
-              <w:rPr>
-                <w:sz w:val="19"/>
-              </w:rPr>
-              <w:t>help_requests_tbl</w:t>
-            </w:r>
-          </w:p>
-        </w:tc>
-      </w:tr>
-      <w:tr>
-        <w:tc>
-          <w:tcPr>
-            <w:tcW w:type="dxa" w:w="864"/>
-          </w:tcPr>
-          <w:p>
-            <w:r>
-              <w:rPr>
-                <w:sz w:val="19"/>
-              </w:rPr>
-              <w:t>D20</w:t>
-            </w:r>
-          </w:p>
-        </w:tc>
-        <w:tc>
-          <w:tcPr>
-            <w:tcW w:type="dxa" w:w="2304"/>
-          </w:tcPr>
-          <w:p>
-            <w:r>
-              <w:rPr>
-                <w:sz w:val="19"/>
-              </w:rPr>
-              <w:t>Audit Logs</w:t>
-            </w:r>
-          </w:p>
-        </w:tc>
-        <w:tc>
-          <w:tcPr>
-            <w:tcW w:type="dxa" w:w="6192"/>
-          </w:tcPr>
-          <w:p>
-            <w:r>
-              <w:rPr>
-                <w:sz w:val="19"/>
-              </w:rPr>
-              <w:t>activity_log_tbl, account_actions_log_tbl, error_log_tbl</w:t>
-            </w:r>
-          </w:p>
-        </w:tc>
-      </w:tr>
-      <w:tr>
-        <w:tc>
-          <w:tcPr>
-            <w:tcW w:type="dxa" w:w="864"/>
-          </w:tcPr>
-          <w:p>
-            <w:r>
-              <w:rPr>
-                <w:sz w:val="19"/>
-              </w:rPr>
-              <w:t>D21</w:t>
-            </w:r>
-          </w:p>
-        </w:tc>
-        <w:tc>
-          <w:tcPr>
-            <w:tcW w:type="dxa" w:w="2304"/>
-          </w:tcPr>
-          <w:p>
-            <w:r>
-              <w:rPr>
-                <w:sz w:val="19"/>
-              </w:rPr>
-              <w:t>Title History</w:t>
-            </w:r>
-          </w:p>
-        </w:tc>
-        <w:tc>
-          <w:tcPr>
-            <w:tcW w:type="dxa" w:w="6192"/>
-          </w:tcPr>
-          <w:p>
-            <w:r>
-              <w:rPr>
-                <w:sz w:val="19"/>
-              </w:rPr>
-              <w:t>title_history_tbl</w:t>
-            </w:r>
-          </w:p>
-        </w:tc>
-      </w:tr>
-      <w:tr>
-        <w:tc>
-          <w:tcPr>
-            <w:tcW w:type="dxa" w:w="864"/>
-          </w:tcPr>
-          <w:p>
-            <w:r>
-              <w:rPr>
-                <w:sz w:val="19"/>
-              </w:rPr>
-              <w:t>D22</w:t>
-            </w:r>
-          </w:p>
-        </w:tc>
-        <w:tc>
-          <w:tcPr>
-            <w:tcW w:type="dxa" w:w="2304"/>
-          </w:tcPr>
-          <w:p>
-            <w:r>
-              <w:rPr>
-                <w:sz w:val="19"/>
-              </w:rPr>
-              <w:t>Game Settings</w:t>
-            </w:r>
-          </w:p>
-        </w:tc>
-        <w:tc>
-          <w:tcPr>
-            <w:tcW w:type="dxa" w:w="6192"/>
-          </w:tcPr>
-          <w:p>
-            <w:r>
-              <w:rPr>
-                <w:sz w:val="19"/>
-              </w:rPr>
-              <w:t>game_settings_tbl</w:t>
-            </w:r>
-          </w:p>
-        </w:tc>
-      </w:tr>
-      <w:tr>
-        <w:tc>
-          <w:tcPr>
-            <w:tcW w:type="dxa" w:w="864"/>
-          </w:tcPr>
-          <w:p>
-            <w:r>
-              <w:rPr>
-                <w:sz w:val="19"/>
-              </w:rPr>
-              <w:t>D23</w:t>
-            </w:r>
-          </w:p>
-        </w:tc>
-        <w:tc>
-          <w:tcPr>
-            <w:tcW w:type="dxa" w:w="2304"/>
-          </w:tcPr>
-          <w:p>
-            <w:r>
-              <w:rPr>
-                <w:sz w:val="19"/>
-              </w:rPr>
-              <w:t>System Settings</w:t>
-            </w:r>
-          </w:p>
-        </w:tc>
-        <w:tc>
-          <w:tcPr>
-            <w:tcW w:type="dxa" w:w="6192"/>
-          </w:tcPr>
-          <w:p>
-            <w:r>
-              <w:rPr>
-                <w:sz w:val="19"/>
-              </w:rPr>
-              <w:t>system_settings_tbl</w:t>
-            </w:r>
-          </w:p>
-        </w:tc>
-      </w:tr>
-    </w:tbl>
-    <w:p>
-      <w:pPr>
-        <w:sectPr>
-          <w:pgSz w:w="12240" w:h="15840"/>
-          <w:pgMar w:top="1440" w:right="1440" w:bottom="1440" w:left="1440" w:header="720" w:footer="720" w:gutter="0"/>
-          <w:cols w:space="720"/>
-          <w:docGrid w:linePitch="360"/>
-        </w:sectPr>
-      </w:pPr>
-    </w:p>
-    <w:p>
-      <w:pPr>
-        <w:pStyle w:val="Heading1"/>
-      </w:pPr>
-      <w:r>
-        <w:t>Context Diagram</w:t>
-      </w:r>
-    </w:p>
-    <w:p>
-      <w:r>
-        <w:t>The context diagram shows CobraByte as a single process and the three kinds of users (Admin, Mentor and Learner) plus the Email Server that it exchanges data with.</w:t>
-      </w:r>
-    </w:p>
-    <w:p>
-      <w:pPr>
-        <w:jc w:val="center"/>
-      </w:pPr>
-      <w:r>
         <w:drawing>
           <wp:inline xmlns:a="http://schemas.openxmlformats.org/drawingml/2006/main" xmlns:pic="http://schemas.openxmlformats.org/drawingml/2006/picture">
-            <wp:extent cx="8673352" cy="5211110"/>
+            <wp:extent cx="5943600" cy="6262007"/>
             <wp:docPr id="2" name="Picture 2"/>
             <wp:cNvGraphicFramePr>
               <a:graphicFrameLocks noChangeAspect="1"/>
@@ -1181,7 +64,7 @@
               <a:graphicData uri="http://schemas.openxmlformats.org/drawingml/2006/picture">
                 <pic:pic>
                   <pic:nvPicPr>
-                    <pic:cNvPr id="0" name="context.png"/>
+                    <pic:cNvPr id="0" name="level0.png"/>
                     <pic:cNvPicPr/>
                   </pic:nvPicPr>
                   <pic:blipFill>
@@ -1193,7 +76,7 @@
                   <pic:spPr>
                     <a:xfrm>
                       <a:off x="0" y="0"/>
-                      <a:ext cx="8673352" cy="5211110"/>
+                      <a:ext cx="5943600" cy="6262007"/>
                     </a:xfrm>
                     <a:prstGeom prst="rect"/>
                   </pic:spPr>
@@ -1206,35 +89,17 @@
     </w:p>
     <w:p>
       <w:pPr>
-        <w:sectPr>
-          <w:pgSz w:w="15840" w:h="12240" w:orient="landscape"/>
-          <w:pgMar w:top="864" w:right="864" w:bottom="864" w:left="864" w:header="720" w:footer="720" w:gutter="0"/>
-          <w:cols w:space="720"/>
-          <w:docGrid w:linePitch="360"/>
-        </w:sectPr>
-      </w:pPr>
-    </w:p>
-    <w:p>
-      <w:pPr>
-        <w:pStyle w:val="Heading1"/>
+        <w:pageBreakBefore/>
       </w:pPr>
       <w:r>
-        <w:t>DFD Level 0</w:t>
+        <w:t>Registration – DFD Level 1</w:t>
       </w:r>
     </w:p>
     <w:p>
       <w:r>
-        <w:t>Level 0 breaks CobraByte into its nine major processes and shows the main data stores each one reads and writes.</w:t>
-      </w:r>
-    </w:p>
-    <w:p>
-      <w:pPr>
-        <w:jc w:val="center"/>
-      </w:pPr>
-      <w:r>
         <w:drawing>
           <wp:inline xmlns:a="http://schemas.openxmlformats.org/drawingml/2006/main" xmlns:pic="http://schemas.openxmlformats.org/drawingml/2006/picture">
-            <wp:extent cx="6675119" cy="6861185"/>
+            <wp:extent cx="5943600" cy="4493941"/>
             <wp:docPr id="3" name="Picture 3"/>
             <wp:cNvGraphicFramePr>
               <a:graphicFrameLocks noChangeAspect="1"/>
@@ -1243,7 +108,7 @@
               <a:graphicData uri="http://schemas.openxmlformats.org/drawingml/2006/picture">
                 <pic:pic>
                   <pic:nvPicPr>
-                    <pic:cNvPr id="0" name="level0.png"/>
+                    <pic:cNvPr id="0" name="l1_registration.png"/>
                     <pic:cNvPicPr/>
                   </pic:nvPicPr>
                   <pic:blipFill>
@@ -1255,7 +120,7 @@
                   <pic:spPr>
                     <a:xfrm>
                       <a:off x="0" y="0"/>
-                      <a:ext cx="6675119" cy="6861185"/>
+                      <a:ext cx="5943600" cy="4493941"/>
                     </a:xfrm>
                     <a:prstGeom prst="rect"/>
                   </pic:spPr>
@@ -1268,35 +133,17 @@
     </w:p>
     <w:p>
       <w:pPr>
-        <w:sectPr>
-          <w:pgSz w:w="12240" w:h="15840"/>
-          <w:pgMar w:top="864" w:right="864" w:bottom="864" w:left="864" w:header="720" w:footer="720" w:gutter="0"/>
-          <w:cols w:space="720"/>
-          <w:docGrid w:linePitch="360"/>
-        </w:sectPr>
-      </w:pPr>
-    </w:p>
-    <w:p>
-      <w:pPr>
-        <w:pStyle w:val="Heading1"/>
+        <w:pageBreakBefore/>
       </w:pPr>
       <w:r>
-        <w:t>Registration – DFD Level 1</w:t>
+        <w:t>User Authentication – DFD Level 1</w:t>
       </w:r>
     </w:p>
     <w:p>
       <w:r>
-        <w:t>Learners create their own account after verifying their email with a one-time code. Admins create Admin and Mentor accounts directly from Account &amp; Security.</w:t>
-      </w:r>
-    </w:p>
-    <w:p>
-      <w:pPr>
-        <w:jc w:val="center"/>
-      </w:pPr>
-      <w:r>
         <w:drawing>
           <wp:inline xmlns:a="http://schemas.openxmlformats.org/drawingml/2006/main" xmlns:pic="http://schemas.openxmlformats.org/drawingml/2006/picture">
-            <wp:extent cx="8961120" cy="3211968"/>
+            <wp:extent cx="5943600" cy="3977087"/>
             <wp:docPr id="4" name="Picture 4"/>
             <wp:cNvGraphicFramePr>
               <a:graphicFrameLocks noChangeAspect="1"/>
@@ -1305,7 +152,7 @@
               <a:graphicData uri="http://schemas.openxmlformats.org/drawingml/2006/picture">
                 <pic:pic>
                   <pic:nvPicPr>
-                    <pic:cNvPr id="0" name="l1_registration.png"/>
+                    <pic:cNvPr id="0" name="l1_auth.png"/>
                     <pic:cNvPicPr/>
                   </pic:nvPicPr>
                   <pic:blipFill>
@@ -1317,7 +164,7 @@
                   <pic:spPr>
                     <a:xfrm>
                       <a:off x="0" y="0"/>
-                      <a:ext cx="8961120" cy="3211968"/>
+                      <a:ext cx="5943600" cy="3977087"/>
                     </a:xfrm>
                     <a:prstGeom prst="rect"/>
                   </pic:spPr>
@@ -1330,35 +177,17 @@
     </w:p>
     <w:p>
       <w:pPr>
-        <w:sectPr>
-          <w:pgSz w:w="15840" w:h="12240" w:orient="landscape"/>
-          <w:pgMar w:top="864" w:right="864" w:bottom="864" w:left="864" w:header="720" w:footer="720" w:gutter="0"/>
-          <w:cols w:space="720"/>
-          <w:docGrid w:linePitch="360"/>
-        </w:sectPr>
-      </w:pPr>
-    </w:p>
-    <w:p>
-      <w:pPr>
-        <w:pStyle w:val="Heading1"/>
+        <w:pageBreakBefore/>
       </w:pPr>
       <w:r>
-        <w:t>User Authentication – DFD Level 1</w:t>
+        <w:t>Course Content Management – DFD Level 1</w:t>
       </w:r>
     </w:p>
     <w:p>
       <w:r>
-        <w:t>There are two sign-in doors: the learner login page and the staff login page (Admin and Mentor). Both share one set of rules for passwords, lockout, sessions and recovery.</w:t>
-      </w:r>
-    </w:p>
-    <w:p>
-      <w:pPr>
-        <w:jc w:val="center"/>
-      </w:pPr>
-      <w:r>
         <w:drawing>
           <wp:inline xmlns:a="http://schemas.openxmlformats.org/drawingml/2006/main" xmlns:pic="http://schemas.openxmlformats.org/drawingml/2006/picture">
-            <wp:extent cx="8961120" cy="4705042"/>
+            <wp:extent cx="5943600" cy="3162004"/>
             <wp:docPr id="5" name="Picture 5"/>
             <wp:cNvGraphicFramePr>
               <a:graphicFrameLocks noChangeAspect="1"/>
@@ -1367,7 +196,7 @@
               <a:graphicData uri="http://schemas.openxmlformats.org/drawingml/2006/picture">
                 <pic:pic>
                   <pic:nvPicPr>
-                    <pic:cNvPr id="0" name="l1_auth.png"/>
+                    <pic:cNvPr id="0" name="l1_course.png"/>
                     <pic:cNvPicPr/>
                   </pic:nvPicPr>
                   <pic:blipFill>
@@ -1379,7 +208,7 @@
                   <pic:spPr>
                     <a:xfrm>
                       <a:off x="0" y="0"/>
-                      <a:ext cx="8961120" cy="4705042"/>
+                      <a:ext cx="5943600" cy="3162004"/>
                     </a:xfrm>
                     <a:prstGeom prst="rect"/>
                   </pic:spPr>
@@ -1392,35 +221,17 @@
     </w:p>
     <w:p>
       <w:pPr>
-        <w:sectPr>
-          <w:pgSz w:w="15840" w:h="12240" w:orient="landscape"/>
-          <w:pgMar w:top="864" w:right="864" w:bottom="864" w:left="864" w:header="720" w:footer="720" w:gutter="0"/>
-          <w:cols w:space="720"/>
-          <w:docGrid w:linePitch="360"/>
-        </w:sectPr>
-      </w:pPr>
-    </w:p>
-    <w:p>
-      <w:pPr>
-        <w:pStyle w:val="Heading1"/>
+        <w:pageBreakBefore/>
       </w:pPr>
       <w:r>
-        <w:t>Course Content Management – DFD Level 1</w:t>
+        <w:t>Learning Activity Management – DFD Level 1</w:t>
       </w:r>
     </w:p>
     <w:p>
       <w:r>
-        <w:t>Mentors build the course as Chapters, then Modules, then Lessons, with Video Tutorials attached to lessons. Every create and rename is recorded in the title history.</w:t>
-      </w:r>
-    </w:p>
-    <w:p>
-      <w:pPr>
-        <w:jc w:val="center"/>
-      </w:pPr>
-      <w:r>
         <w:drawing>
           <wp:inline xmlns:a="http://schemas.openxmlformats.org/drawingml/2006/main" xmlns:pic="http://schemas.openxmlformats.org/drawingml/2006/picture">
-            <wp:extent cx="8961120" cy="4646985"/>
+            <wp:extent cx="5943600" cy="3740369"/>
             <wp:docPr id="6" name="Picture 6"/>
             <wp:cNvGraphicFramePr>
               <a:graphicFrameLocks noChangeAspect="1"/>
@@ -1429,7 +240,7 @@
               <a:graphicData uri="http://schemas.openxmlformats.org/drawingml/2006/picture">
                 <pic:pic>
                   <pic:nvPicPr>
-                    <pic:cNvPr id="0" name="l1_course.png"/>
+                    <pic:cNvPr id="0" name="l1_activities.png"/>
                     <pic:cNvPicPr/>
                   </pic:nvPicPr>
                   <pic:blipFill>
@@ -1441,7 +252,7 @@
                   <pic:spPr>
                     <a:xfrm>
                       <a:off x="0" y="0"/>
-                      <a:ext cx="8961120" cy="4646985"/>
+                      <a:ext cx="5943600" cy="3740369"/>
                     </a:xfrm>
                     <a:prstGeom prst="rect"/>
                   </pic:spPr>
@@ -1454,35 +265,17 @@
     </w:p>
     <w:p>
       <w:pPr>
-        <w:sectPr>
-          <w:pgSz w:w="15840" w:h="12240" w:orient="landscape"/>
-          <w:pgMar w:top="864" w:right="864" w:bottom="864" w:left="864" w:header="720" w:footer="720" w:gutter="0"/>
-          <w:cols w:space="720"/>
-          <w:docGrid w:linePitch="360"/>
-        </w:sectPr>
-      </w:pPr>
-    </w:p>
-    <w:p>
-      <w:pPr>
-        <w:pStyle w:val="Heading1"/>
+        <w:pageBreakBefore/>
       </w:pPr>
       <w:r>
-        <w:t>Learning Activity Management – DFD Level 1</w:t>
+        <w:t>Publishing – DFD Level 1</w:t>
       </w:r>
     </w:p>
     <w:p>
       <w:r>
-        <w:t>Mentors attach learning activities (Multiple Choice, Fill in the Blanks, Flashcards) and coding exercises to lessons. Admins set the per-question timer for each game.</w:t>
-      </w:r>
-    </w:p>
-    <w:p>
-      <w:pPr>
-        <w:jc w:val="center"/>
-      </w:pPr>
-      <w:r>
         <w:drawing>
           <wp:inline xmlns:a="http://schemas.openxmlformats.org/drawingml/2006/main" xmlns:pic="http://schemas.openxmlformats.org/drawingml/2006/picture">
-            <wp:extent cx="8482124" cy="5212080"/>
+            <wp:extent cx="5943600" cy="4754880"/>
             <wp:docPr id="7" name="Picture 7"/>
             <wp:cNvGraphicFramePr>
               <a:graphicFrameLocks noChangeAspect="1"/>
@@ -1491,7 +284,7 @@
               <a:graphicData uri="http://schemas.openxmlformats.org/drawingml/2006/picture">
                 <pic:pic>
                   <pic:nvPicPr>
-                    <pic:cNvPr id="0" name="l1_activities.png"/>
+                    <pic:cNvPr id="0" name="l1_publishing.png"/>
                     <pic:cNvPicPr/>
                   </pic:nvPicPr>
                   <pic:blipFill>
@@ -1503,7 +296,7 @@
                   <pic:spPr>
                     <a:xfrm>
                       <a:off x="0" y="0"/>
-                      <a:ext cx="8482124" cy="5212080"/>
+                      <a:ext cx="5943600" cy="4754880"/>
                     </a:xfrm>
                     <a:prstGeom prst="rect"/>
                   </pic:spPr>
@@ -1516,35 +309,17 @@
     </w:p>
     <w:p>
       <w:pPr>
-        <w:sectPr>
-          <w:pgSz w:w="15840" w:h="12240" w:orient="landscape"/>
-          <w:pgMar w:top="864" w:right="864" w:bottom="864" w:left="864" w:header="720" w:footer="720" w:gutter="0"/>
-          <w:cols w:space="720"/>
-          <w:docGrid w:linePitch="360"/>
-        </w:sectPr>
-      </w:pPr>
-    </w:p>
-    <w:p>
-      <w:pPr>
-        <w:pStyle w:val="Heading1"/>
+        <w:pageBreakBefore/>
       </w:pPr>
       <w:r>
-        <w:t>Publishing – DFD Level 1</w:t>
+        <w:t>Learning – DFD Level 1</w:t>
       </w:r>
     </w:p>
     <w:p>
       <w:r>
-        <w:t>Publishing moves content from Draft to Ready to Publish to Published. Only mentors change status; admins can open Publishing and Preview but cannot change anything.</w:t>
-      </w:r>
-    </w:p>
-    <w:p>
-      <w:pPr>
-        <w:jc w:val="center"/>
-      </w:pPr>
-      <w:r>
         <w:drawing>
           <wp:inline xmlns:a="http://schemas.openxmlformats.org/drawingml/2006/main" xmlns:pic="http://schemas.openxmlformats.org/drawingml/2006/picture">
-            <wp:extent cx="6712210" cy="5213475"/>
+            <wp:extent cx="5943600" cy="5099911"/>
             <wp:docPr id="8" name="Picture 8"/>
             <wp:cNvGraphicFramePr>
               <a:graphicFrameLocks noChangeAspect="1"/>
@@ -1553,7 +328,7 @@
               <a:graphicData uri="http://schemas.openxmlformats.org/drawingml/2006/picture">
                 <pic:pic>
                   <pic:nvPicPr>
-                    <pic:cNvPr id="0" name="l1_publishing.png"/>
+                    <pic:cNvPr id="0" name="l1_learning.png"/>
                     <pic:cNvPicPr/>
                   </pic:nvPicPr>
                   <pic:blipFill>
@@ -1565,7 +340,7 @@
                   <pic:spPr>
                     <a:xfrm>
                       <a:off x="0" y="0"/>
-                      <a:ext cx="6712210" cy="5213475"/>
+                      <a:ext cx="5943600" cy="5099911"/>
                     </a:xfrm>
                     <a:prstGeom prst="rect"/>
                   </pic:spPr>
@@ -1578,35 +353,17 @@
     </w:p>
     <w:p>
       <w:pPr>
-        <w:sectPr>
-          <w:pgSz w:w="15840" w:h="12240" w:orient="landscape"/>
-          <w:pgMar w:top="864" w:right="864" w:bottom="864" w:left="864" w:header="720" w:footer="720" w:gutter="0"/>
-          <w:cols w:space="720"/>
-          <w:docGrid w:linePitch="360"/>
-        </w:sectPr>
-      </w:pPr>
-    </w:p>
-    <w:p>
-      <w:pPr>
-        <w:pStyle w:val="Heading1"/>
+        <w:pageBreakBefore/>
       </w:pPr>
       <w:r>
-        <w:t>Learning – DFD Level 1</w:t>
+        <w:t>Progress and Achievements – DFD Level 1</w:t>
       </w:r>
     </w:p>
     <w:p>
       <w:r>
-        <w:t>The learner works through the course in order: open the Learning Map, read the lesson and watch its video, play the activities, solve the coding exercise, and retake missed items when needed.</w:t>
-      </w:r>
-    </w:p>
-    <w:p>
-      <w:pPr>
-        <w:jc w:val="center"/>
-      </w:pPr>
-      <w:r>
         <w:drawing>
           <wp:inline xmlns:a="http://schemas.openxmlformats.org/drawingml/2006/main" xmlns:pic="http://schemas.openxmlformats.org/drawingml/2006/picture">
-            <wp:extent cx="6675120" cy="5562600"/>
+            <wp:extent cx="5943600" cy="5797009"/>
             <wp:docPr id="9" name="Picture 9"/>
             <wp:cNvGraphicFramePr>
               <a:graphicFrameLocks noChangeAspect="1"/>
@@ -1615,7 +372,7 @@
               <a:graphicData uri="http://schemas.openxmlformats.org/drawingml/2006/picture">
                 <pic:pic>
                   <pic:nvPicPr>
-                    <pic:cNvPr id="0" name="l1_learning.png"/>
+                    <pic:cNvPr id="0" name="l1_progress.png"/>
                     <pic:cNvPicPr/>
                   </pic:nvPicPr>
                   <pic:blipFill>
@@ -1627,7 +384,7 @@
                   <pic:spPr>
                     <a:xfrm>
                       <a:off x="0" y="0"/>
-                      <a:ext cx="6675120" cy="5562600"/>
+                      <a:ext cx="5943600" cy="5797009"/>
                     </a:xfrm>
                     <a:prstGeom prst="rect"/>
                   </pic:spPr>
@@ -1640,35 +397,17 @@
     </w:p>
     <w:p>
       <w:pPr>
-        <w:sectPr>
-          <w:pgSz w:w="12240" w:h="15840"/>
-          <w:pgMar w:top="864" w:right="864" w:bottom="864" w:left="864" w:header="720" w:footer="720" w:gutter="0"/>
-          <w:cols w:space="720"/>
-          <w:docGrid w:linePitch="360"/>
-        </w:sectPr>
-      </w:pPr>
-    </w:p>
-    <w:p>
-      <w:pPr>
-        <w:pStyle w:val="Heading1"/>
+        <w:pageBreakBefore/>
       </w:pPr>
       <w:r>
-        <w:t>Progress and Achievements – DFD Level 1</w:t>
+        <w:t>Account Management – DFD Level 1</w:t>
       </w:r>
     </w:p>
     <w:p>
       <w:r>
-        <w:t>Results feed the module gate: a module passes when all its lessons are done and the lesson average is at least 80%. Passing unlocks the next content; missed items become recommendations; badges and the certificate are awarded automatically.</w:t>
-      </w:r>
-    </w:p>
-    <w:p>
-      <w:pPr>
-        <w:jc w:val="center"/>
-      </w:pPr>
-      <w:r>
         <w:drawing>
           <wp:inline xmlns:a="http://schemas.openxmlformats.org/drawingml/2006/main" xmlns:pic="http://schemas.openxmlformats.org/drawingml/2006/picture">
-            <wp:extent cx="8961120" cy="3743060"/>
+            <wp:extent cx="5943600" cy="4959509"/>
             <wp:docPr id="10" name="Picture 10"/>
             <wp:cNvGraphicFramePr>
               <a:graphicFrameLocks noChangeAspect="1"/>
@@ -1677,7 +416,7 @@
               <a:graphicData uri="http://schemas.openxmlformats.org/drawingml/2006/picture">
                 <pic:pic>
                   <pic:nvPicPr>
-                    <pic:cNvPr id="0" name="l1_progress.png"/>
+                    <pic:cNvPr id="0" name="l1_accounts.png"/>
                     <pic:cNvPicPr/>
                   </pic:nvPicPr>
                   <pic:blipFill>
@@ -1689,7 +428,7 @@
                   <pic:spPr>
                     <a:xfrm>
                       <a:off x="0" y="0"/>
-                      <a:ext cx="8961120" cy="3743060"/>
+                      <a:ext cx="5943600" cy="4959509"/>
                     </a:xfrm>
                     <a:prstGeom prst="rect"/>
                   </pic:spPr>
@@ -1702,35 +441,17 @@
     </w:p>
     <w:p>
       <w:pPr>
-        <w:sectPr>
-          <w:pgSz w:w="15840" w:h="12240" w:orient="landscape"/>
-          <w:pgMar w:top="864" w:right="864" w:bottom="864" w:left="864" w:header="720" w:footer="720" w:gutter="0"/>
-          <w:cols w:space="720"/>
-          <w:docGrid w:linePitch="360"/>
-        </w:sectPr>
-      </w:pPr>
-    </w:p>
-    <w:p>
-      <w:pPr>
-        <w:pStyle w:val="Heading1"/>
+        <w:pageBreakBefore/>
       </w:pPr>
       <w:r>
-        <w:t>Account Management – DFD Level 1</w:t>
+        <w:t>Reports and Monitoring – DFD Level 1</w:t>
       </w:r>
     </w:p>
     <w:p>
       <w:r>
-        <w:t>Admins look after every account: search, archive and restore, unlock, answer help requests, and reset learner progress. Every user can edit their own profile or ask to delete their own account.</w:t>
-      </w:r>
-    </w:p>
-    <w:p>
-      <w:pPr>
-        <w:jc w:val="center"/>
-      </w:pPr>
-      <w:r>
         <w:drawing>
           <wp:inline xmlns:a="http://schemas.openxmlformats.org/drawingml/2006/main" xmlns:pic="http://schemas.openxmlformats.org/drawingml/2006/picture">
-            <wp:extent cx="6675120" cy="5404209"/>
+            <wp:extent cx="5943600" cy="6185325"/>
             <wp:docPr id="11" name="Picture 11"/>
             <wp:cNvGraphicFramePr>
               <a:graphicFrameLocks noChangeAspect="1"/>
@@ -1739,7 +460,7 @@
               <a:graphicData uri="http://schemas.openxmlformats.org/drawingml/2006/picture">
                 <pic:pic>
                   <pic:nvPicPr>
-                    <pic:cNvPr id="0" name="l1_accounts.png"/>
+                    <pic:cNvPr id="0" name="l1_reports.png"/>
                     <pic:cNvPicPr/>
                   </pic:nvPicPr>
                   <pic:blipFill>
@@ -1751,7 +472,7 @@
                   <pic:spPr>
                     <a:xfrm>
                       <a:off x="0" y="0"/>
-                      <a:ext cx="6675120" cy="5404209"/>
+                      <a:ext cx="5943600" cy="6185325"/>
                     </a:xfrm>
                     <a:prstGeom prst="rect"/>
                   </pic:spPr>
@@ -1764,35 +485,17 @@
     </w:p>
     <w:p>
       <w:pPr>
-        <w:sectPr>
-          <w:pgSz w:w="12240" w:h="15840"/>
-          <w:pgMar w:top="864" w:right="864" w:bottom="864" w:left="864" w:header="720" w:footer="720" w:gutter="0"/>
-          <w:cols w:space="720"/>
-          <w:docGrid w:linePitch="360"/>
-        </w:sectPr>
-      </w:pPr>
-    </w:p>
-    <w:p>
-      <w:pPr>
-        <w:pStyle w:val="Heading1"/>
+        <w:pageBreakBefore/>
       </w:pPr>
       <w:r>
-        <w:t>Reports and Monitoring – DFD Level 1</w:t>
+        <w:t>Validate Registration – DFD Level 2</w:t>
       </w:r>
     </w:p>
     <w:p>
       <w:r>
-        <w:t>These processes only read data. Admins get the dashboard, online users, analytics, reports, logs and system monitors. Mentors see learner progress and how their content is doing.</w:t>
-      </w:r>
-    </w:p>
-    <w:p>
-      <w:pPr>
-        <w:jc w:val="center"/>
-      </w:pPr>
-      <w:r>
         <w:drawing>
           <wp:inline xmlns:a="http://schemas.openxmlformats.org/drawingml/2006/main" xmlns:pic="http://schemas.openxmlformats.org/drawingml/2006/picture">
-            <wp:extent cx="6675120" cy="6721475"/>
+            <wp:extent cx="5507380" cy="7680959"/>
             <wp:docPr id="12" name="Picture 12"/>
             <wp:cNvGraphicFramePr>
               <a:graphicFrameLocks noChangeAspect="1"/>
@@ -1801,7 +504,7 @@
               <a:graphicData uri="http://schemas.openxmlformats.org/drawingml/2006/picture">
                 <pic:pic>
                   <pic:nvPicPr>
-                    <pic:cNvPr id="0" name="l1_reports.png"/>
+                    <pic:cNvPr id="0" name="l2_validate_registration.png"/>
                     <pic:cNvPicPr/>
                   </pic:nvPicPr>
                   <pic:blipFill>
@@ -1813,7 +516,7 @@
                   <pic:spPr>
                     <a:xfrm>
                       <a:off x="0" y="0"/>
-                      <a:ext cx="6675120" cy="6721475"/>
+                      <a:ext cx="5507380" cy="7680959"/>
                     </a:xfrm>
                     <a:prstGeom prst="rect"/>
                   </pic:spPr>
@@ -1826,35 +529,17 @@
     </w:p>
     <w:p>
       <w:pPr>
-        <w:sectPr>
-          <w:pgSz w:w="12240" w:h="15840"/>
-          <w:pgMar w:top="864" w:right="864" w:bottom="864" w:left="864" w:header="720" w:footer="720" w:gutter="0"/>
-          <w:cols w:space="720"/>
-          <w:docGrid w:linePitch="360"/>
-        </w:sectPr>
-      </w:pPr>
-    </w:p>
-    <w:p>
-      <w:pPr>
-        <w:pStyle w:val="Heading1"/>
+        <w:pageBreakBefore/>
       </w:pPr>
       <w:r>
-        <w:t>Validate Registration – DFD Level 2</w:t>
+        <w:t>Log In – DFD Level 2</w:t>
       </w:r>
     </w:p>
     <w:p>
       <w:r>
-        <w:t>Process 1.2 checks every sign-up rule on the server before a verification code is sent.</w:t>
-      </w:r>
-    </w:p>
-    <w:p>
-      <w:pPr>
-        <w:jc w:val="center"/>
-      </w:pPr>
-      <w:r>
         <w:drawing>
           <wp:inline xmlns:a="http://schemas.openxmlformats.org/drawingml/2006/main" xmlns:pic="http://schemas.openxmlformats.org/drawingml/2006/picture">
-            <wp:extent cx="5735525" cy="7498079"/>
+            <wp:extent cx="5943600" cy="5333067"/>
             <wp:docPr id="13" name="Picture 13"/>
             <wp:cNvGraphicFramePr>
               <a:graphicFrameLocks noChangeAspect="1"/>
@@ -1863,7 +548,7 @@
               <a:graphicData uri="http://schemas.openxmlformats.org/drawingml/2006/picture">
                 <pic:pic>
                   <pic:nvPicPr>
-                    <pic:cNvPr id="0" name="l2_validate_registration.png"/>
+                    <pic:cNvPr id="0" name="l2_login.png"/>
                     <pic:cNvPicPr/>
                   </pic:nvPicPr>
                   <pic:blipFill>
@@ -1875,7 +560,7 @@
                   <pic:spPr>
                     <a:xfrm>
                       <a:off x="0" y="0"/>
-                      <a:ext cx="5735525" cy="7498079"/>
+                      <a:ext cx="5943600" cy="5333067"/>
                     </a:xfrm>
                     <a:prstGeom prst="rect"/>
                   </pic:spPr>
@@ -1888,35 +573,17 @@
     </w:p>
     <w:p>
       <w:pPr>
-        <w:sectPr>
-          <w:pgSz w:w="12240" w:h="15840"/>
-          <w:pgMar w:top="864" w:right="864" w:bottom="864" w:left="864" w:header="720" w:footer="720" w:gutter="0"/>
-          <w:cols w:space="720"/>
-          <w:docGrid w:linePitch="360"/>
-        </w:sectPr>
-      </w:pPr>
-    </w:p>
-    <w:p>
-      <w:pPr>
-        <w:pStyle w:val="Heading1"/>
+        <w:pageBreakBefore/>
       </w:pPr>
       <w:r>
-        <w:t>Log In – DFD Level 2</w:t>
+        <w:t>Recover Password – DFD Level 2</w:t>
       </w:r>
     </w:p>
     <w:p>
       <w:r>
-        <w:t>Process 2.1 checks which door was used, the account status, and the password, then creates a session and sends the user to their role's home page.</w:t>
-      </w:r>
-    </w:p>
-    <w:p>
-      <w:pPr>
-        <w:jc w:val="center"/>
-      </w:pPr>
-      <w:r>
         <w:drawing>
           <wp:inline xmlns:a="http://schemas.openxmlformats.org/drawingml/2006/main" xmlns:pic="http://schemas.openxmlformats.org/drawingml/2006/picture">
-            <wp:extent cx="6675120" cy="5989444"/>
+            <wp:extent cx="5943600" cy="6748397"/>
             <wp:docPr id="14" name="Picture 14"/>
             <wp:cNvGraphicFramePr>
               <a:graphicFrameLocks noChangeAspect="1"/>
@@ -1925,7 +592,7 @@
               <a:graphicData uri="http://schemas.openxmlformats.org/drawingml/2006/picture">
                 <pic:pic>
                   <pic:nvPicPr>
-                    <pic:cNvPr id="0" name="l2_login.png"/>
+                    <pic:cNvPr id="0" name="l2_recover_password.png"/>
                     <pic:cNvPicPr/>
                   </pic:nvPicPr>
                   <pic:blipFill>
@@ -1937,7 +604,7 @@
                   <pic:spPr>
                     <a:xfrm>
                       <a:off x="0" y="0"/>
-                      <a:ext cx="6675120" cy="5989444"/>
+                      <a:ext cx="5943600" cy="6748397"/>
                     </a:xfrm>
                     <a:prstGeom prst="rect"/>
                   </pic:spPr>
@@ -1950,35 +617,17 @@
     </w:p>
     <w:p>
       <w:pPr>
-        <w:sectPr>
-          <w:pgSz w:w="12240" w:h="15840"/>
-          <w:pgMar w:top="864" w:right="864" w:bottom="864" w:left="864" w:header="720" w:footer="720" w:gutter="0"/>
-          <w:cols w:space="720"/>
-          <w:docGrid w:linePitch="360"/>
-        </w:sectPr>
-      </w:pPr>
-    </w:p>
-    <w:p>
-      <w:pPr>
-        <w:pStyle w:val="Heading1"/>
+        <w:pageBreakBefore/>
       </w:pPr>
       <w:r>
-        <w:t>Recover Password – DFD Level 2</w:t>
+        <w:t>Manage Lessons – DFD Level 2</w:t>
       </w:r>
     </w:p>
     <w:p>
       <w:r>
-        <w:t>Process 2.3 resets a forgotten password. The new password is accepted only after the emailed code has been verified.</w:t>
-      </w:r>
-    </w:p>
-    <w:p>
-      <w:pPr>
-        <w:jc w:val="center"/>
-      </w:pPr>
-      <w:r>
         <w:drawing>
           <wp:inline xmlns:a="http://schemas.openxmlformats.org/drawingml/2006/main" xmlns:pic="http://schemas.openxmlformats.org/drawingml/2006/picture">
-            <wp:extent cx="6428168" cy="7496051"/>
+            <wp:extent cx="5943600" cy="4778087"/>
             <wp:docPr id="15" name="Picture 15"/>
             <wp:cNvGraphicFramePr>
               <a:graphicFrameLocks noChangeAspect="1"/>
@@ -1987,7 +636,7 @@
               <a:graphicData uri="http://schemas.openxmlformats.org/drawingml/2006/picture">
                 <pic:pic>
                   <pic:nvPicPr>
-                    <pic:cNvPr id="0" name="l2_recover_password.png"/>
+                    <pic:cNvPr id="0" name="l2_lessons.png"/>
                     <pic:cNvPicPr/>
                   </pic:nvPicPr>
                   <pic:blipFill>
@@ -1999,7 +648,7 @@
                   <pic:spPr>
                     <a:xfrm>
                       <a:off x="0" y="0"/>
-                      <a:ext cx="6428168" cy="7496051"/>
+                      <a:ext cx="5943600" cy="4778087"/>
                     </a:xfrm>
                     <a:prstGeom prst="rect"/>
                   </pic:spPr>
@@ -2012,35 +661,17 @@
     </w:p>
     <w:p>
       <w:pPr>
-        <w:sectPr>
-          <w:pgSz w:w="12240" w:h="15840"/>
-          <w:pgMar w:top="864" w:right="864" w:bottom="864" w:left="864" w:header="720" w:footer="720" w:gutter="0"/>
-          <w:cols w:space="720"/>
-          <w:docGrid w:linePitch="360"/>
-        </w:sectPr>
-      </w:pPr>
-    </w:p>
-    <w:p>
-      <w:pPr>
-        <w:pStyle w:val="Heading1"/>
+        <w:pageBreakBefore/>
       </w:pPr>
       <w:r>
-        <w:t>Manage Lessons – DFD Level 2</w:t>
+        <w:t>Archive and Restore Content – DFD Level 2</w:t>
       </w:r>
     </w:p>
     <w:p>
       <w:r>
-        <w:t>Process 3.3 handles the Upload Lesson page. A lesson is saved as a Draft any number of times and becomes Ready to Publish once it passes the checks.</w:t>
-      </w:r>
-    </w:p>
-    <w:p>
-      <w:pPr>
-        <w:jc w:val="center"/>
-      </w:pPr>
-      <w:r>
         <w:drawing>
           <wp:inline xmlns:a="http://schemas.openxmlformats.org/drawingml/2006/main" xmlns:pic="http://schemas.openxmlformats.org/drawingml/2006/picture">
-            <wp:extent cx="6675120" cy="5301756"/>
+            <wp:extent cx="5943600" cy="2716437"/>
             <wp:docPr id="16" name="Picture 16"/>
             <wp:cNvGraphicFramePr>
               <a:graphicFrameLocks noChangeAspect="1"/>
@@ -2049,7 +680,7 @@
               <a:graphicData uri="http://schemas.openxmlformats.org/drawingml/2006/picture">
                 <pic:pic>
                   <pic:nvPicPr>
-                    <pic:cNvPr id="0" name="l2_lessons.png"/>
+                    <pic:cNvPr id="0" name="l2_archive.png"/>
                     <pic:cNvPicPr/>
                   </pic:nvPicPr>
                   <pic:blipFill>
@@ -2061,7 +692,7 @@
                   <pic:spPr>
                     <a:xfrm>
                       <a:off x="0" y="0"/>
-                      <a:ext cx="6675120" cy="5301756"/>
+                      <a:ext cx="5943600" cy="2716437"/>
                     </a:xfrm>
                     <a:prstGeom prst="rect"/>
                   </pic:spPr>
@@ -2074,35 +705,17 @@
     </w:p>
     <w:p>
       <w:pPr>
-        <w:sectPr>
-          <w:pgSz w:w="12240" w:h="15840"/>
-          <w:pgMar w:top="864" w:right="864" w:bottom="864" w:left="864" w:header="720" w:footer="720" w:gutter="0"/>
-          <w:cols w:space="720"/>
-          <w:docGrid w:linePitch="360"/>
-        </w:sectPr>
-      </w:pPr>
-    </w:p>
-    <w:p>
-      <w:pPr>
-        <w:pStyle w:val="Heading1"/>
+        <w:pageBreakBefore/>
       </w:pPr>
       <w:r>
-        <w:t>Archive and Restore Content – DFD Level 2</w:t>
+        <w:t>Build Multiple Choice Items – DFD Level 2</w:t>
       </w:r>
     </w:p>
     <w:p>
       <w:r>
-        <w:t>Process 3.5 archives content without losing learner data. Archived items can be restored, together with the items under them, or deleted for good.</w:t>
-      </w:r>
-    </w:p>
-    <w:p>
-      <w:pPr>
-        <w:jc w:val="center"/>
-      </w:pPr>
-      <w:r>
         <w:drawing>
           <wp:inline xmlns:a="http://schemas.openxmlformats.org/drawingml/2006/main" xmlns:pic="http://schemas.openxmlformats.org/drawingml/2006/picture">
-            <wp:extent cx="8961120" cy="4020127"/>
+            <wp:extent cx="5943600" cy="6027644"/>
             <wp:docPr id="17" name="Picture 17"/>
             <wp:cNvGraphicFramePr>
               <a:graphicFrameLocks noChangeAspect="1"/>
@@ -2111,7 +724,7 @@
               <a:graphicData uri="http://schemas.openxmlformats.org/drawingml/2006/picture">
                 <pic:pic>
                   <pic:nvPicPr>
-                    <pic:cNvPr id="0" name="l2_archive.png"/>
+                    <pic:cNvPr id="0" name="l2_mcq.png"/>
                     <pic:cNvPicPr/>
                   </pic:nvPicPr>
                   <pic:blipFill>
@@ -2123,7 +736,7 @@
                   <pic:spPr>
                     <a:xfrm>
                       <a:off x="0" y="0"/>
-                      <a:ext cx="8961120" cy="4020127"/>
+                      <a:ext cx="5943600" cy="6027644"/>
                     </a:xfrm>
                     <a:prstGeom prst="rect"/>
                   </pic:spPr>
@@ -2136,35 +749,17 @@
     </w:p>
     <w:p>
       <w:pPr>
-        <w:sectPr>
-          <w:pgSz w:w="15840" w:h="12240" w:orient="landscape"/>
-          <w:pgMar w:top="864" w:right="864" w:bottom="864" w:left="864" w:header="720" w:footer="720" w:gutter="0"/>
-          <w:cols w:space="720"/>
-          <w:docGrid w:linePitch="360"/>
-        </w:sectPr>
-      </w:pPr>
-    </w:p>
-    <w:p>
-      <w:pPr>
-        <w:pStyle w:val="Heading1"/>
+        <w:pageBreakBefore/>
       </w:pPr>
       <w:r>
-        <w:t>Build Multiple Choice Items – DFD Level 2</w:t>
+        <w:t>Create Coding Exercise – DFD Level 2</w:t>
       </w:r>
     </w:p>
     <w:p>
       <w:r>
-        <w:t>Process 4.2 builds the question pool of a Multiple Choice activity. Learners are later served random draws of five items from this pool.</w:t>
-      </w:r>
-    </w:p>
-    <w:p>
-      <w:pPr>
-        <w:jc w:val="center"/>
-      </w:pPr>
-      <w:r>
         <w:drawing>
           <wp:inline xmlns:a="http://schemas.openxmlformats.org/drawingml/2006/main" xmlns:pic="http://schemas.openxmlformats.org/drawingml/2006/picture">
-            <wp:extent cx="6675120" cy="6769508"/>
+            <wp:extent cx="5943599" cy="5902125"/>
             <wp:docPr id="18" name="Picture 18"/>
             <wp:cNvGraphicFramePr>
               <a:graphicFrameLocks noChangeAspect="1"/>
@@ -2173,7 +768,7 @@
               <a:graphicData uri="http://schemas.openxmlformats.org/drawingml/2006/picture">
                 <pic:pic>
                   <pic:nvPicPr>
-                    <pic:cNvPr id="0" name="l2_mcq.png"/>
+                    <pic:cNvPr id="0" name="l2_exercise.png"/>
                     <pic:cNvPicPr/>
                   </pic:nvPicPr>
                   <pic:blipFill>
@@ -2185,7 +780,7 @@
                   <pic:spPr>
                     <a:xfrm>
                       <a:off x="0" y="0"/>
-                      <a:ext cx="6675120" cy="6769508"/>
+                      <a:ext cx="5943599" cy="5902125"/>
                     </a:xfrm>
                     <a:prstGeom prst="rect"/>
                   </pic:spPr>
@@ -2198,35 +793,17 @@
     </w:p>
     <w:p>
       <w:pPr>
-        <w:sectPr>
-          <w:pgSz w:w="12240" w:h="15840"/>
-          <w:pgMar w:top="864" w:right="864" w:bottom="864" w:left="864" w:header="720" w:footer="720" w:gutter="0"/>
-          <w:cols w:space="720"/>
-          <w:docGrid w:linePitch="360"/>
-        </w:sectPr>
-      </w:pPr>
-    </w:p>
-    <w:p>
-      <w:pPr>
-        <w:pStyle w:val="Heading1"/>
+        <w:pageBreakBefore/>
       </w:pPr>
       <w:r>
-        <w:t>Create Coding Exercise – DFD Level 2</w:t>
+        <w:t>Publish Content – DFD Level 2</w:t>
       </w:r>
     </w:p>
     <w:p>
       <w:r>
-        <w:t>Process 4.5 creates a Python coding exercise. A submission is graded on its printed output and on the syntax tags the mentor marks as required.</w:t>
-      </w:r>
-    </w:p>
-    <w:p>
-      <w:pPr>
-        <w:jc w:val="center"/>
-      </w:pPr>
-      <w:r>
         <w:drawing>
           <wp:inline xmlns:a="http://schemas.openxmlformats.org/drawingml/2006/main" xmlns:pic="http://schemas.openxmlformats.org/drawingml/2006/picture">
-            <wp:extent cx="6675120" cy="6628541"/>
+            <wp:extent cx="5943600" cy="7240879"/>
             <wp:docPr id="19" name="Picture 19"/>
             <wp:cNvGraphicFramePr>
               <a:graphicFrameLocks noChangeAspect="1"/>
@@ -2235,7 +812,7 @@
               <a:graphicData uri="http://schemas.openxmlformats.org/drawingml/2006/picture">
                 <pic:pic>
                   <pic:nvPicPr>
-                    <pic:cNvPr id="0" name="l2_exercise.png"/>
+                    <pic:cNvPr id="0" name="l2_publish.png"/>
                     <pic:cNvPicPr/>
                   </pic:nvPicPr>
                   <pic:blipFill>
@@ -2247,7 +824,7 @@
                   <pic:spPr>
                     <a:xfrm>
                       <a:off x="0" y="0"/>
-                      <a:ext cx="6675120" cy="6628541"/>
+                      <a:ext cx="5943600" cy="7240879"/>
                     </a:xfrm>
                     <a:prstGeom prst="rect"/>
                   </pic:spPr>
@@ -2260,35 +837,17 @@
     </w:p>
     <w:p>
       <w:pPr>
-        <w:sectPr>
-          <w:pgSz w:w="12240" w:h="15840"/>
-          <w:pgMar w:top="864" w:right="864" w:bottom="864" w:left="864" w:header="720" w:footer="720" w:gutter="0"/>
-          <w:cols w:space="720"/>
-          <w:docGrid w:linePitch="360"/>
-        </w:sectPr>
-      </w:pPr>
-    </w:p>
-    <w:p>
-      <w:pPr>
-        <w:pStyle w:val="Heading1"/>
+        <w:pageBreakBefore/>
       </w:pPr>
       <w:r>
-        <w:t>Publish Content – DFD Level 2</w:t>
+        <w:t>Play Learning Activity – DFD Level 2</w:t>
       </w:r>
     </w:p>
     <w:p>
       <w:r>
-        <w:t>Process 5.3 publishes an item only when it is Ready and its parent is already Published. Every Ready item inside it is published with it, so a chapter is published once.</w:t>
-      </w:r>
-    </w:p>
-    <w:p>
-      <w:pPr>
-        <w:jc w:val="center"/>
-      </w:pPr>
-      <w:r>
         <w:drawing>
           <wp:inline xmlns:a="http://schemas.openxmlformats.org/drawingml/2006/main" xmlns:pic="http://schemas.openxmlformats.org/drawingml/2006/picture">
-            <wp:extent cx="6619673" cy="7499485"/>
+            <wp:extent cx="5943600" cy="2891850"/>
             <wp:docPr id="20" name="Picture 20"/>
             <wp:cNvGraphicFramePr>
               <a:graphicFrameLocks noChangeAspect="1"/>
@@ -2297,7 +856,7 @@
               <a:graphicData uri="http://schemas.openxmlformats.org/drawingml/2006/picture">
                 <pic:pic>
                   <pic:nvPicPr>
-                    <pic:cNvPr id="0" name="l2_publish.png"/>
+                    <pic:cNvPr id="0" name="l2_play.png"/>
                     <pic:cNvPicPr/>
                   </pic:nvPicPr>
                   <pic:blipFill>
@@ -2309,7 +868,7 @@
                   <pic:spPr>
                     <a:xfrm>
                       <a:off x="0" y="0"/>
-                      <a:ext cx="6619673" cy="7499485"/>
+                      <a:ext cx="5943600" cy="2891850"/>
                     </a:xfrm>
                     <a:prstGeom prst="rect"/>
                   </pic:spPr>
@@ -2322,35 +881,17 @@
     </w:p>
     <w:p>
       <w:pPr>
-        <w:sectPr>
-          <w:pgSz w:w="12240" w:h="15840"/>
-          <w:pgMar w:top="864" w:right="864" w:bottom="864" w:left="864" w:header="720" w:footer="720" w:gutter="0"/>
-          <w:cols w:space="720"/>
-          <w:docGrid w:linePitch="360"/>
-        </w:sectPr>
-      </w:pPr>
-    </w:p>
-    <w:p>
-      <w:pPr>
-        <w:pStyle w:val="Heading1"/>
+        <w:pageBreakBefore/>
       </w:pPr>
       <w:r>
-        <w:t>Play Learning Activity – DFD Level 2</w:t>
+        <w:t>Solve Coding Exercise – DFD Level 2</w:t>
       </w:r>
     </w:p>
     <w:p>
       <w:r>
-        <w:t>Process 6.3 is the play engine shared by Multiple Choice, Fill in the Blanks and Flashcards. The server keeps the drawn items, the timer and the lives, so refreshing the page cannot reset them.</w:t>
-      </w:r>
-    </w:p>
-    <w:p>
-      <w:pPr>
-        <w:jc w:val="center"/>
-      </w:pPr>
-      <w:r>
         <w:drawing>
           <wp:inline xmlns:a="http://schemas.openxmlformats.org/drawingml/2006/main" xmlns:pic="http://schemas.openxmlformats.org/drawingml/2006/picture">
-            <wp:extent cx="8961120" cy="4609442"/>
+            <wp:extent cx="5470672" cy="7682653"/>
             <wp:docPr id="21" name="Picture 21"/>
             <wp:cNvGraphicFramePr>
               <a:graphicFrameLocks noChangeAspect="1"/>
@@ -2359,7 +900,7 @@
               <a:graphicData uri="http://schemas.openxmlformats.org/drawingml/2006/picture">
                 <pic:pic>
                   <pic:nvPicPr>
-                    <pic:cNvPr id="0" name="l2_play.png"/>
+                    <pic:cNvPr id="0" name="l2_solve.png"/>
                     <pic:cNvPicPr/>
                   </pic:nvPicPr>
                   <pic:blipFill>
@@ -2371,7 +912,7 @@
                   <pic:spPr>
                     <a:xfrm>
                       <a:off x="0" y="0"/>
-                      <a:ext cx="8961120" cy="4609442"/>
+                      <a:ext cx="5470672" cy="7682653"/>
                     </a:xfrm>
                     <a:prstGeom prst="rect"/>
                   </pic:spPr>
@@ -2384,35 +925,17 @@
     </w:p>
     <w:p>
       <w:pPr>
-        <w:sectPr>
-          <w:pgSz w:w="15840" w:h="12240" w:orient="landscape"/>
-          <w:pgMar w:top="864" w:right="864" w:bottom="864" w:left="864" w:header="720" w:footer="720" w:gutter="0"/>
-          <w:cols w:space="720"/>
-          <w:docGrid w:linePitch="360"/>
-        </w:sectPr>
-      </w:pPr>
-    </w:p>
-    <w:p>
-      <w:pPr>
-        <w:pStyle w:val="Heading1"/>
+        <w:pageBreakBefore/>
       </w:pPr>
       <w:r>
-        <w:t>Solve Coding Exercise – DFD Level 2</w:t>
+        <w:t>Find Weak Spots – DFD Level 2</w:t>
       </w:r>
     </w:p>
     <w:p>
       <w:r>
-        <w:t>Process 6.4 runs the learner's Python in the browser (Pyodide). The server grades it: the code must run without errors, print the expected output, and use every required tag.</w:t>
-      </w:r>
-    </w:p>
-    <w:p>
-      <w:pPr>
-        <w:jc w:val="center"/>
-      </w:pPr>
-      <w:r>
         <w:drawing>
           <wp:inline xmlns:a="http://schemas.openxmlformats.org/drawingml/2006/main" xmlns:pic="http://schemas.openxmlformats.org/drawingml/2006/picture">
-            <wp:extent cx="5919101" cy="7499732"/>
+            <wp:extent cx="5943600" cy="6573284"/>
             <wp:docPr id="22" name="Picture 22"/>
             <wp:cNvGraphicFramePr>
               <a:graphicFrameLocks noChangeAspect="1"/>
@@ -2421,7 +944,7 @@
               <a:graphicData uri="http://schemas.openxmlformats.org/drawingml/2006/picture">
                 <pic:pic>
                   <pic:nvPicPr>
-                    <pic:cNvPr id="0" name="l2_solve.png"/>
+                    <pic:cNvPr id="0" name="l2_weak_spots.png"/>
                     <pic:cNvPicPr/>
                   </pic:nvPicPr>
                   <pic:blipFill>
@@ -2433,7 +956,7 @@
                   <pic:spPr>
                     <a:xfrm>
                       <a:off x="0" y="0"/>
-                      <a:ext cx="5919101" cy="7499732"/>
+                      <a:ext cx="5943600" cy="6573284"/>
                     </a:xfrm>
                     <a:prstGeom prst="rect"/>
                   </pic:spPr>
@@ -2446,35 +969,17 @@
     </w:p>
     <w:p>
       <w:pPr>
-        <w:sectPr>
-          <w:pgSz w:w="12240" w:h="15840"/>
-          <w:pgMar w:top="864" w:right="864" w:bottom="864" w:left="864" w:header="720" w:footer="720" w:gutter="0"/>
-          <w:cols w:space="720"/>
-          <w:docGrid w:linePitch="360"/>
-        </w:sectPr>
-      </w:pPr>
-    </w:p>
-    <w:p>
-      <w:pPr>
-        <w:pStyle w:val="Heading1"/>
+        <w:pageBreakBefore/>
       </w:pPr>
       <w:r>
-        <w:t>Find Weak Spots – DFD Level 2</w:t>
+        <w:t>Award Badges – DFD Level 2</w:t>
       </w:r>
     </w:p>
     <w:p>
       <w:r>
-        <w:t>Process 7.4 links each missed item to the part of the lesson that teaches it, so the learner re-reads exactly that part. No manual tagging is needed.</w:t>
-      </w:r>
-    </w:p>
-    <w:p>
-      <w:pPr>
-        <w:jc w:val="center"/>
-      </w:pPr>
-      <w:r>
         <w:drawing>
           <wp:inline xmlns:a="http://schemas.openxmlformats.org/drawingml/2006/main" xmlns:pic="http://schemas.openxmlformats.org/drawingml/2006/picture">
-            <wp:extent cx="6675120" cy="7351908"/>
+            <wp:extent cx="5943600" cy="6694055"/>
             <wp:docPr id="23" name="Picture 23"/>
             <wp:cNvGraphicFramePr>
               <a:graphicFrameLocks noChangeAspect="1"/>
@@ -2483,7 +988,7 @@
               <a:graphicData uri="http://schemas.openxmlformats.org/drawingml/2006/picture">
                 <pic:pic>
                   <pic:nvPicPr>
-                    <pic:cNvPr id="0" name="l2_weak_spots.png"/>
+                    <pic:cNvPr id="0" name="l2_badges.png"/>
                     <pic:cNvPicPr/>
                   </pic:nvPicPr>
                   <pic:blipFill>
@@ -2495,7 +1000,7 @@
                   <pic:spPr>
                     <a:xfrm>
                       <a:off x="0" y="0"/>
-                      <a:ext cx="6675120" cy="7351908"/>
+                      <a:ext cx="5943600" cy="6694055"/>
                     </a:xfrm>
                     <a:prstGeom prst="rect"/>
                   </pic:spPr>
@@ -2508,35 +1013,17 @@
     </w:p>
     <w:p>
       <w:pPr>
-        <w:sectPr>
-          <w:pgSz w:w="12240" w:h="15840"/>
-          <w:pgMar w:top="864" w:right="864" w:bottom="864" w:left="864" w:header="720" w:footer="720" w:gutter="0"/>
-          <w:cols w:space="720"/>
-          <w:docGrid w:linePitch="360"/>
-        </w:sectPr>
-      </w:pPr>
-    </w:p>
-    <w:p>
-      <w:pPr>
-        <w:pStyle w:val="Heading1"/>
+        <w:pageBreakBefore/>
       </w:pPr>
       <w:r>
-        <w:t>Award Badges – DFD Level 2</w:t>
+        <w:t>Archive and Restore Accounts – DFD Level 2</w:t>
       </w:r>
     </w:p>
     <w:p>
       <w:r>
-        <w:t>Process 7.6 checks badges whenever the learner opens their profile or the notification bell syncs. A badge, once earned, is never taken back.</w:t>
-      </w:r>
-    </w:p>
-    <w:p>
-      <w:pPr>
-        <w:jc w:val="center"/>
-      </w:pPr>
-      <w:r>
         <w:drawing>
           <wp:inline xmlns:a="http://schemas.openxmlformats.org/drawingml/2006/main" xmlns:pic="http://schemas.openxmlformats.org/drawingml/2006/picture">
-            <wp:extent cx="6675120" cy="7139337"/>
+            <wp:extent cx="5943600" cy="4597444"/>
             <wp:docPr id="24" name="Picture 24"/>
             <wp:cNvGraphicFramePr>
               <a:graphicFrameLocks noChangeAspect="1"/>
@@ -2545,7 +1032,7 @@
               <a:graphicData uri="http://schemas.openxmlformats.org/drawingml/2006/picture">
                 <pic:pic>
                   <pic:nvPicPr>
-                    <pic:cNvPr id="0" name="l2_badges.png"/>
+                    <pic:cNvPr id="0" name="l2_archive_account.png"/>
                     <pic:cNvPicPr/>
                   </pic:nvPicPr>
                   <pic:blipFill>
@@ -2557,7 +1044,7 @@
                   <pic:spPr>
                     <a:xfrm>
                       <a:off x="0" y="0"/>
-                      <a:ext cx="6675120" cy="7139337"/>
+                      <a:ext cx="5943600" cy="4597444"/>
                     </a:xfrm>
                     <a:prstGeom prst="rect"/>
                   </pic:spPr>
@@ -2570,35 +1057,17 @@
     </w:p>
     <w:p>
       <w:pPr>
-        <w:sectPr>
-          <w:pgSz w:w="12240" w:h="15840"/>
-          <w:pgMar w:top="864" w:right="864" w:bottom="864" w:left="864" w:header="720" w:footer="720" w:gutter="0"/>
-          <w:cols w:space="720"/>
-          <w:docGrid w:linePitch="360"/>
-        </w:sectPr>
-      </w:pPr>
-    </w:p>
-    <w:p>
-      <w:pPr>
-        <w:pStyle w:val="Heading1"/>
+        <w:pageBreakBefore/>
       </w:pPr>
       <w:r>
-        <w:t>Archive and Restore Accounts – DFD Level 2</w:t>
+        <w:t>Handle Help Requests – DFD Level 2</w:t>
       </w:r>
     </w:p>
     <w:p>
       <w:r>
-        <w:t>Process 8.2 archives an account without deleting any of its data. An admin cannot archive their own account or the last active admin.</w:t>
-      </w:r>
-    </w:p>
-    <w:p>
-      <w:pPr>
-        <w:jc w:val="center"/>
-      </w:pPr>
-      <w:r>
         <w:drawing>
           <wp:inline xmlns:a="http://schemas.openxmlformats.org/drawingml/2006/main" xmlns:pic="http://schemas.openxmlformats.org/drawingml/2006/picture">
-            <wp:extent cx="6738630" cy="5212409"/>
+            <wp:extent cx="5943600" cy="3314903"/>
             <wp:docPr id="25" name="Picture 25"/>
             <wp:cNvGraphicFramePr>
               <a:graphicFrameLocks noChangeAspect="1"/>
@@ -2607,7 +1076,7 @@
               <a:graphicData uri="http://schemas.openxmlformats.org/drawingml/2006/picture">
                 <pic:pic>
                   <pic:nvPicPr>
-                    <pic:cNvPr id="0" name="l2_archive_account.png"/>
+                    <pic:cNvPr id="0" name="l2_help.png"/>
                     <pic:cNvPicPr/>
                   </pic:nvPicPr>
                   <pic:blipFill>
@@ -2619,7 +1088,7 @@
                   <pic:spPr>
                     <a:xfrm>
                       <a:off x="0" y="0"/>
-                      <a:ext cx="6738630" cy="5212409"/>
+                      <a:ext cx="5943600" cy="3314903"/>
                     </a:xfrm>
                     <a:prstGeom prst="rect"/>
                   </pic:spPr>
@@ -2632,35 +1101,17 @@
     </w:p>
     <w:p>
       <w:pPr>
-        <w:sectPr>
-          <w:pgSz w:w="15840" w:h="12240" w:orient="landscape"/>
-          <w:pgMar w:top="864" w:right="864" w:bottom="864" w:left="864" w:header="720" w:footer="720" w:gutter="0"/>
-          <w:cols w:space="720"/>
-          <w:docGrid w:linePitch="360"/>
-        </w:sectPr>
-      </w:pPr>
-    </w:p>
-    <w:p>
-      <w:pPr>
-        <w:pStyle w:val="Heading1"/>
+        <w:pageBreakBefore/>
       </w:pPr>
       <w:r>
-        <w:t>Handle Help Requests – DFD Level 2</w:t>
+        <w:t>Generate Reports – DFD Level 2</w:t>
       </w:r>
     </w:p>
     <w:p>
       <w:r>
-        <w:t>Process 8.4 covers the staff login page's "Can't get in? Ask an admin" form. The form never reveals whether an account exists, and only admins can act on a request.</w:t>
-      </w:r>
-    </w:p>
-    <w:p>
-      <w:pPr>
-        <w:jc w:val="center"/>
-      </w:pPr>
-      <w:r>
         <w:drawing>
           <wp:inline xmlns:a="http://schemas.openxmlformats.org/drawingml/2006/main" xmlns:pic="http://schemas.openxmlformats.org/drawingml/2006/picture">
-            <wp:extent cx="8961120" cy="4879972"/>
+            <wp:extent cx="5943600" cy="5118890"/>
             <wp:docPr id="26" name="Picture 26"/>
             <wp:cNvGraphicFramePr>
               <a:graphicFrameLocks noChangeAspect="1"/>
@@ -2669,7 +1120,7 @@
               <a:graphicData uri="http://schemas.openxmlformats.org/drawingml/2006/picture">
                 <pic:pic>
                   <pic:nvPicPr>
-                    <pic:cNvPr id="0" name="l2_help.png"/>
+                    <pic:cNvPr id="0" name="l2_generate_reports.png"/>
                     <pic:cNvPicPr/>
                   </pic:nvPicPr>
                   <pic:blipFill>
@@ -2681,7 +1132,7 @@
                   <pic:spPr>
                     <a:xfrm>
                       <a:off x="0" y="0"/>
-                      <a:ext cx="8961120" cy="4879972"/>
+                      <a:ext cx="5943600" cy="5118890"/>
                     </a:xfrm>
                     <a:prstGeom prst="rect"/>
                   </pic:spPr>
@@ -2694,35 +1145,17 @@
     </w:p>
     <w:p>
       <w:pPr>
-        <w:sectPr>
-          <w:pgSz w:w="15840" w:h="12240" w:orient="landscape"/>
-          <w:pgMar w:top="864" w:right="864" w:bottom="864" w:left="864" w:header="720" w:footer="720" w:gutter="0"/>
-          <w:cols w:space="720"/>
-          <w:docGrid w:linePitch="360"/>
-        </w:sectPr>
-      </w:pPr>
-    </w:p>
-    <w:p>
-      <w:pPr>
-        <w:pStyle w:val="Heading1"/>
+        <w:pageBreakBefore/>
       </w:pPr>
       <w:r>
-        <w:t>Generate Reports – DFD Level 2</w:t>
+        <w:t>User Authentication – DFD Level 3</w:t>
       </w:r>
     </w:p>
     <w:p>
       <w:r>
-        <w:t>Process 9.4 builds the admin's Reports and Analytics pages. Every score uses the same first-try lesson score the learner sees, and only finished lessons count toward averages.</w:t>
-      </w:r>
-    </w:p>
-    <w:p>
-      <w:pPr>
-        <w:jc w:val="center"/>
-      </w:pPr>
-      <w:r>
         <w:drawing>
           <wp:inline xmlns:a="http://schemas.openxmlformats.org/drawingml/2006/main" xmlns:pic="http://schemas.openxmlformats.org/drawingml/2006/picture">
-            <wp:extent cx="6675120" cy="5324320"/>
+            <wp:extent cx="5943600" cy="5492706"/>
             <wp:docPr id="27" name="Picture 27"/>
             <wp:cNvGraphicFramePr>
               <a:graphicFrameLocks noChangeAspect="1"/>
@@ -2731,7 +1164,7 @@
               <a:graphicData uri="http://schemas.openxmlformats.org/drawingml/2006/picture">
                 <pic:pic>
                   <pic:nvPicPr>
-                    <pic:cNvPr id="0" name="l2_generate_reports.png"/>
+                    <pic:cNvPr id="0" name="l3_verify_password.png"/>
                     <pic:cNvPicPr/>
                   </pic:nvPicPr>
                   <pic:blipFill>
@@ -2743,7 +1176,7 @@
                   <pic:spPr>
                     <a:xfrm>
                       <a:off x="0" y="0"/>
-                      <a:ext cx="6675120" cy="5324320"/>
+                      <a:ext cx="5943600" cy="5492706"/>
                     </a:xfrm>
                     <a:prstGeom prst="rect"/>
                   </pic:spPr>
@@ -2756,35 +1189,17 @@
     </w:p>
     <w:p>
       <w:pPr>
-        <w:sectPr>
-          <w:pgSz w:w="12240" w:h="15840"/>
-          <w:pgMar w:top="864" w:right="864" w:bottom="864" w:left="864" w:header="720" w:footer="720" w:gutter="0"/>
-          <w:cols w:space="720"/>
-          <w:docGrid w:linePitch="360"/>
-        </w:sectPr>
-      </w:pPr>
-    </w:p>
-    <w:p>
-      <w:pPr>
-        <w:pStyle w:val="Heading1"/>
+        <w:pageBreakBefore/>
       </w:pPr>
       <w:r>
-        <w:t>User Authentication – DFD Level 3</w:t>
+        <w:t>User Authentication – DFD Level 4</w:t>
       </w:r>
     </w:p>
     <w:p>
       <w:r>
-        <w:t>Level 3 breaks down process 2.1.3, Verify Password. It enforces the rule of five failed tries followed by a one-minute lockout.</w:t>
-      </w:r>
-    </w:p>
-    <w:p>
-      <w:pPr>
-        <w:jc w:val="center"/>
-      </w:pPr>
-      <w:r>
         <w:drawing>
           <wp:inline xmlns:a="http://schemas.openxmlformats.org/drawingml/2006/main" xmlns:pic="http://schemas.openxmlformats.org/drawingml/2006/picture">
-            <wp:extent cx="6675120" cy="6168732"/>
+            <wp:extent cx="5179497" cy="7680959"/>
             <wp:docPr id="28" name="Picture 28"/>
             <wp:cNvGraphicFramePr>
               <a:graphicFrameLocks noChangeAspect="1"/>
@@ -2793,7 +1208,7 @@
               <a:graphicData uri="http://schemas.openxmlformats.org/drawingml/2006/picture">
                 <pic:pic>
                   <pic:nvPicPr>
-                    <pic:cNvPr id="0" name="l3_verify_password.png"/>
+                    <pic:cNvPr id="0" name="l4_failed_attempt.png"/>
                     <pic:cNvPicPr/>
                   </pic:nvPicPr>
                   <pic:blipFill>
@@ -2805,69 +1220,7 @@
                   <pic:spPr>
                     <a:xfrm>
                       <a:off x="0" y="0"/>
-                      <a:ext cx="6675120" cy="6168732"/>
-                    </a:xfrm>
-                    <a:prstGeom prst="rect"/>
-                  </pic:spPr>
-                </pic:pic>
-              </a:graphicData>
-            </a:graphic>
-          </wp:inline>
-        </w:drawing>
-      </w:r>
-    </w:p>
-    <w:p>
-      <w:pPr>
-        <w:sectPr>
-          <w:pgSz w:w="12240" w:h="15840"/>
-          <w:pgMar w:top="864" w:right="864" w:bottom="864" w:left="864" w:header="720" w:footer="720" w:gutter="0"/>
-          <w:cols w:space="720"/>
-          <w:docGrid w:linePitch="360"/>
-        </w:sectPr>
-      </w:pPr>
-    </w:p>
-    <w:p>
-      <w:pPr>
-        <w:pStyle w:val="Heading1"/>
-      </w:pPr>
-      <w:r>
-        <w:t>User Authentication – DFD Level 4</w:t>
-      </w:r>
-    </w:p>
-    <w:p>
-      <w:r>
-        <w:t>Level 4 breaks down process 2.1.3.3, Handle Failed Attempt. On the fifth wrong password the account is locked for one minute and every admin is alerted.</w:t>
-      </w:r>
-    </w:p>
-    <w:p>
-      <w:pPr>
-        <w:jc w:val="center"/>
-      </w:pPr>
-      <w:r>
-        <w:drawing>
-          <wp:inline xmlns:a="http://schemas.openxmlformats.org/drawingml/2006/main" xmlns:pic="http://schemas.openxmlformats.org/drawingml/2006/picture">
-            <wp:extent cx="5106451" cy="7495971"/>
-            <wp:docPr id="29" name="Picture 29"/>
-            <wp:cNvGraphicFramePr>
-              <a:graphicFrameLocks noChangeAspect="1"/>
-            </wp:cNvGraphicFramePr>
-            <a:graphic>
-              <a:graphicData uri="http://schemas.openxmlformats.org/drawingml/2006/picture">
-                <pic:pic>
-                  <pic:nvPicPr>
-                    <pic:cNvPr id="0" name="l4_failed_attempt.png"/>
-                    <pic:cNvPicPr/>
-                  </pic:nvPicPr>
-                  <pic:blipFill>
-                    <a:blip r:embed="rId37"/>
-                    <a:stretch>
-                      <a:fillRect/>
-                    </a:stretch>
-                  </pic:blipFill>
-                  <pic:spPr>
-                    <a:xfrm>
-                      <a:off x="0" y="0"/>
-                      <a:ext cx="5106451" cy="7495971"/>
+                      <a:ext cx="5179497" cy="7680959"/>
                     </a:xfrm>
                     <a:prstGeom prst="rect"/>
                   </pic:spPr>
@@ -2880,7 +1233,7 @@
     </w:p>
     <w:sectPr>
       <w:pgSz w:w="12240" w:h="15840"/>
-      <w:pgMar w:top="864" w:right="864" w:bottom="864" w:left="864" w:header="720" w:footer="720" w:gutter="0"/>
+      <w:pgMar w:top="1440" w:right="1440" w:bottom="1440" w:left="1440" w:header="720" w:footer="720" w:gutter="0"/>
       <w:cols w:space="720"/>
       <w:docGrid w:linePitch="360"/>
     </w:sectPr>
@@ -3252,7 +1605,7 @@
     <w:qFormat/>
     <w:rsid w:val="00FC693F"/>
     <w:rPr>
-      <w:rFonts w:ascii="Arial" w:hAnsi="Arial"/>
+      <w:rFonts w:ascii="Calibri" w:hAnsi="Calibri"/>
       <w:sz w:val="22"/>
     </w:rPr>
   </w:style>

</xml_diff>

<commit_message>
Fewer flows and no overlapping labels in the DFDs
Broader flow names (a Level 1 flow can be one part of a Level 0 flow),
password reset and help requests left out, and descriptions held back
for now. The renderer reports any label touching a line, box or other
label, and no longer straightens a line through a label.

Co-Authored-By: Claude Opus 5.5 <noreply@anthropic.com>
Claude-Session: https://claude.ai/code/session_0197sgxmB7VL2gdQVtM7kWoL
</commit_message>
<xml_diff>
--- a/docs/CobraByte_Context_Diagram_and_DFD.docx
+++ b/docs/CobraByte_Context_Diagram_and_DFD.docx
@@ -12,7 +12,7 @@
       <w:r>
         <w:drawing>
           <wp:inline xmlns:a="http://schemas.openxmlformats.org/drawingml/2006/main" xmlns:pic="http://schemas.openxmlformats.org/drawingml/2006/picture">
-            <wp:extent cx="5943600" cy="6739426"/>
+            <wp:extent cx="5724144" cy="4930445"/>
             <wp:docPr id="1" name="Picture 1"/>
             <wp:cNvGraphicFramePr>
               <a:graphicFrameLocks noChangeAspect="1"/>
@@ -33,7 +33,7 @@
                   <pic:spPr>
                     <a:xfrm>
                       <a:off x="0" y="0"/>
-                      <a:ext cx="5943600" cy="6739426"/>
+                      <a:ext cx="5724144" cy="4930445"/>
                     </a:xfrm>
                     <a:prstGeom prst="rect"/>
                   </pic:spPr>
@@ -59,26 +59,6 @@
     </w:p>
     <w:p>
       <w:pPr>
-        <w:spacing w:before="0" w:after="0" w:line="480" w:lineRule="auto"/>
-        <w:ind w:firstLine="720"/>
-        <w:jc w:val="both"/>
-      </w:pPr>
-      <w:r>
-        <w:t>This Context Diagram shows CobraByte: Learn Python the Interactive Way as a single process (0) and its three external entities: the Learner, the Mentor and the Admin.</w:t>
-      </w:r>
-    </w:p>
-    <w:p>
-      <w:pPr>
-        <w:spacing w:before="0" w:after="0" w:line="480" w:lineRule="auto"/>
-        <w:ind w:firstLine="720"/>
-        <w:jc w:val="both"/>
-      </w:pPr>
-      <w:r>
-        <w:t>The Learner sends "Registration Details", "Login Credentials", "Lesson Selection", "Activity Answers", "Exercise Code" and "Profile Changes", and receives "System Access", "Lesson Content", "Answer Feedback", "Exercise Result", "Weak Spot Review" and their "Badges and Certificate". The Mentor sends the course and activity details, "Publishing Decision" and "Badge Details", and receives a "Content Preview", "Recommendation Report" and "Learner Progress Report". The Admin sends "Staff Account Details", "Account Action", "Help Request Decision" and "Timer Settings", and receives "Account Details", the "Help Request List" and the "System Report".</w:t>
-      </w:r>
-    </w:p>
-    <w:p>
-      <w:pPr>
         <w:keepNext/>
         <w:pageBreakBefore/>
         <w:spacing w:before="0" w:after="0" w:line="240" w:lineRule="auto"/>
@@ -87,7 +67,7 @@
       <w:r>
         <w:drawing>
           <wp:inline xmlns:a="http://schemas.openxmlformats.org/drawingml/2006/main" xmlns:pic="http://schemas.openxmlformats.org/drawingml/2006/picture">
-            <wp:extent cx="4698831" cy="6949439"/>
+            <wp:extent cx="5109547" cy="6947890"/>
             <wp:docPr id="2" name="Picture 2"/>
             <wp:cNvGraphicFramePr>
               <a:graphicFrameLocks noChangeAspect="1"/>
@@ -108,7 +88,7 @@
                   <pic:spPr>
                     <a:xfrm>
                       <a:off x="0" y="0"/>
-                      <a:ext cx="4698831" cy="6949439"/>
+                      <a:ext cx="5109547" cy="6947890"/>
                     </a:xfrm>
                     <a:prstGeom prst="rect"/>
                   </pic:spPr>
@@ -142,7 +122,7 @@
       <w:r>
         <w:drawing>
           <wp:inline xmlns:a="http://schemas.openxmlformats.org/drawingml/2006/main" xmlns:pic="http://schemas.openxmlformats.org/drawingml/2006/picture">
-            <wp:extent cx="5943600" cy="5835300"/>
+            <wp:extent cx="5943600" cy="5917451"/>
             <wp:docPr id="3" name="Picture 3"/>
             <wp:cNvGraphicFramePr>
               <a:graphicFrameLocks noChangeAspect="1"/>
@@ -163,7 +143,7 @@
                   <pic:spPr>
                     <a:xfrm>
                       <a:off x="0" y="0"/>
-                      <a:ext cx="5943600" cy="5835300"/>
+                      <a:ext cx="5943600" cy="5917451"/>
                     </a:xfrm>
                     <a:prstGeom prst="rect"/>
                   </pic:spPr>
@@ -197,7 +177,7 @@
       <w:r>
         <w:drawing>
           <wp:inline xmlns:a="http://schemas.openxmlformats.org/drawingml/2006/main" xmlns:pic="http://schemas.openxmlformats.org/drawingml/2006/picture">
-            <wp:extent cx="5943600" cy="4483331"/>
+            <wp:extent cx="5943600" cy="3935344"/>
             <wp:docPr id="4" name="Picture 4"/>
             <wp:cNvGraphicFramePr>
               <a:graphicFrameLocks noChangeAspect="1"/>
@@ -218,7 +198,7 @@
                   <pic:spPr>
                     <a:xfrm>
                       <a:off x="0" y="0"/>
-                      <a:ext cx="5943600" cy="4483331"/>
+                      <a:ext cx="5943600" cy="3935344"/>
                     </a:xfrm>
                     <a:prstGeom prst="rect"/>
                   </pic:spPr>
@@ -244,36 +224,6 @@
     </w:p>
     <w:p>
       <w:pPr>
-        <w:spacing w:before="0" w:after="0" w:line="480" w:lineRule="auto"/>
-        <w:ind w:firstLine="720"/>
-        <w:jc w:val="both"/>
-      </w:pPr>
-      <w:r>
-        <w:t>This Level 0 Data Flow Diagram breaks CobraByte into its nine major processes. Because each process uses several data stores, the users and data stores are drawn next to every process that uses them; a repeated box is marked with a diagonal line (users) or a second line in its ID strip (data stores).</w:t>
-      </w:r>
-    </w:p>
-    <w:p>
-      <w:pPr>
-        <w:spacing w:before="0" w:after="0" w:line="480" w:lineRule="auto"/>
-        <w:ind w:firstLine="720"/>
-        <w:jc w:val="both"/>
-      </w:pPr>
-      <w:r>
-        <w:t>Register Account (1.0) checks the "Registration Details" against Accounts (D1) and saves the "New Account Record". Authenticate User (2.0) checks the "Login Credentials" against Accounts (D1), keeps a "Login Record" in Login Logs (D2) and a "Session Record" in Sessions (D3), and returns "System Access". The Mentor builds the course through Manage Course Content (3.0), which saves Chapters (D4), Modules (D5), Lessons (D6) and Video Tutorials (D7), and through Manage Learning Activities (4.0), which saves Learning Activities (D8) and Coding Exercises (D9); the Admin's "Timer Settings" are saved in Game Settings (D10). Publish Content (5.0) gives a "Content Preview" and saves the "Publishing Status".</w:t>
-      </w:r>
-    </w:p>
-    <w:p>
-      <w:pPr>
-        <w:spacing w:before="0" w:after="0" w:line="480" w:lineRule="auto"/>
-        <w:ind w:firstLine="720"/>
-        <w:jc w:val="both"/>
-      </w:pPr>
-      <w:r>
-        <w:t>Deliver Lessons and Activities (6.0) shows the Learner the published lessons and checks their answers and code, saving them in Learner Answers (D11), Exercise Submissions (D12) and Learner Progress (D13). Track Progress and Rewards (7.0) uses these records to unlock lessons, save Recommendations (D16), Badges (D14) and Certificates (D15). Manage Accounts (8.0) handles account updates, help requests in Help Requests (D17) and the Audit Logs (D18), and Generate Reports (9.0) produces the "Learner Progress Report" and the "System Report".</w:t>
-      </w:r>
-    </w:p>
-    <w:p>
-      <w:pPr>
         <w:keepNext/>
         <w:pageBreakBefore/>
         <w:spacing w:before="0" w:after="0" w:line="240" w:lineRule="auto"/>
@@ -282,7 +232,7 @@
       <w:r>
         <w:drawing>
           <wp:inline xmlns:a="http://schemas.openxmlformats.org/drawingml/2006/main" xmlns:pic="http://schemas.openxmlformats.org/drawingml/2006/picture">
-            <wp:extent cx="5943600" cy="6109237"/>
+            <wp:extent cx="5550408" cy="5027543"/>
             <wp:docPr id="5" name="Picture 5"/>
             <wp:cNvGraphicFramePr>
               <a:graphicFrameLocks noChangeAspect="1"/>
@@ -303,7 +253,7 @@
                   <pic:spPr>
                     <a:xfrm>
                       <a:off x="0" y="0"/>
-                      <a:ext cx="5943600" cy="6109237"/>
+                      <a:ext cx="5550408" cy="5027543"/>
                     </a:xfrm>
                     <a:prstGeom prst="rect"/>
                   </pic:spPr>
@@ -329,26 +279,6 @@
     </w:p>
     <w:p>
       <w:pPr>
-        <w:spacing w:before="0" w:after="0" w:line="480" w:lineRule="auto"/>
-        <w:ind w:firstLine="720"/>
-        <w:jc w:val="both"/>
-      </w:pPr>
-      <w:r>
-        <w:t>This Level 1 Data Flow Diagram breaks down Register Account (1.0). Validate Registration (1.1) checks the Learner's "Registration Details" against the "Existing Account Records" in Accounts (D1). Send Verification Code (1.2) sends the Learner a "Verification Code" and passes the "Pending Registration" to Verify Code (1.3), which compares it with the Learner's "Code Confirmation".</w:t>
-      </w:r>
-    </w:p>
-    <w:p>
-      <w:pPr>
-        <w:spacing w:before="0" w:after="0" w:line="480" w:lineRule="auto"/>
-        <w:ind w:firstLine="720"/>
-        <w:jc w:val="both"/>
-      </w:pPr>
-      <w:r>
-        <w:t>Save Learner Account (1.4) saves the "New Account Record" in Accounts (D1) and returns the "Registration Status". Admin and Mentor accounts are made by the Admin through Create Staff Account (1.5), which checks the "Staff Account Details", saves the "New Account Record" and returns the "Staff Account ID".</w:t>
-      </w:r>
-    </w:p>
-    <w:p>
-      <w:pPr>
         <w:keepNext/>
         <w:pageBreakBefore/>
         <w:spacing w:before="0" w:after="0" w:line="240" w:lineRule="auto"/>
@@ -357,7 +287,7 @@
       <w:r>
         <w:drawing>
           <wp:inline xmlns:a="http://schemas.openxmlformats.org/drawingml/2006/main" xmlns:pic="http://schemas.openxmlformats.org/drawingml/2006/picture">
-            <wp:extent cx="5943600" cy="4634807"/>
+            <wp:extent cx="5943600" cy="3061854"/>
             <wp:docPr id="6" name="Picture 6"/>
             <wp:cNvGraphicFramePr>
               <a:graphicFrameLocks noChangeAspect="1"/>
@@ -378,7 +308,7 @@
                   <pic:spPr>
                     <a:xfrm>
                       <a:off x="0" y="0"/>
-                      <a:ext cx="5943600" cy="4634807"/>
+                      <a:ext cx="5943600" cy="3061854"/>
                     </a:xfrm>
                     <a:prstGeom prst="rect"/>
                   </pic:spPr>
@@ -400,26 +330,6 @@
       </w:r>
       <w:r>
         <w:t>Data Flow Diagram Level 1 - 2.0 Authenticate User</w:t>
-      </w:r>
-    </w:p>
-    <w:p>
-      <w:pPr>
-        <w:spacing w:before="0" w:after="0" w:line="480" w:lineRule="auto"/>
-        <w:ind w:firstLine="720"/>
-        <w:jc w:val="both"/>
-      </w:pPr>
-      <w:r>
-        <w:t>This Level 1 Data Flow Diagram breaks down Authenticate User (2.0), used the same way by the Learner, Mentor and Admin. Verify Credentials (2.1) checks the "Login Credentials" against the "Account Records" in Accounts (D1), updates the "Login Status" (failed attempts and lockout), and keeps a "Login Record" in Login Logs (D2).</w:t>
-      </w:r>
-    </w:p>
-    <w:p>
-      <w:pPr>
-        <w:spacing w:before="0" w:after="0" w:line="480" w:lineRule="auto"/>
-        <w:ind w:firstLine="720"/>
-        <w:jc w:val="both"/>
-      </w:pPr>
-      <w:r>
-        <w:t>For a "Verified User", Create Session (2.2) saves the "Session Record" in Sessions (D3) and gives "System Access". Reset Password (2.3) takes a "Password Reset Request", sends a "Password Reset Code" and saves the new password as part of the "Login Status" in Accounts (D1).</w:t>
       </w:r>
     </w:p>
     <w:p>
@@ -479,16 +389,6 @@
     </w:p>
     <w:p>
       <w:pPr>
-        <w:spacing w:before="0" w:after="0" w:line="480" w:lineRule="auto"/>
-        <w:ind w:firstLine="720"/>
-        <w:jc w:val="both"/>
-      </w:pPr>
-      <w:r>
-        <w:t>This Level 1 Data Flow Diagram breaks down Manage Course Content (3.0). The Mentor's "Chapter Details" are saved by Add Chapter (3.1) in Chapters (D4). Add Module (3.2) uses the "Chapter List" to save the "Module Record" in Modules (D5), and Add Lesson (3.3) uses the "Module List" to save the "Lesson Record" in Lessons (D6). Attach Video Tutorial (3.4) links a "Video Link" to a lesson from the "Lesson List" and saves the "Video Record" in Video Tutorials (D7).</w:t>
-      </w:r>
-    </w:p>
-    <w:p>
-      <w:pPr>
         <w:keepNext/>
         <w:pageBreakBefore/>
         <w:spacing w:before="0" w:after="0" w:line="240" w:lineRule="auto"/>
@@ -544,26 +444,6 @@
     </w:p>
     <w:p>
       <w:pPr>
-        <w:spacing w:before="0" w:after="0" w:line="480" w:lineRule="auto"/>
-        <w:ind w:firstLine="720"/>
-        <w:jc w:val="both"/>
-      </w:pPr>
-      <w:r>
-        <w:t>This Level 1 Data Flow Diagram breaks down Manage Learning Activities (4.0). Create Activity (4.1) saves the Mentor's "Activity Details" for a lesson from the "Lesson List" as an "Activity Record" in Learning Activities (D8) and passes the "New Activity" to Add Question Items (4.2), which saves the "Question Items" for Multiple Choice, Fill in the Blanks or Flashcards.</w:t>
-      </w:r>
-    </w:p>
-    <w:p>
-      <w:pPr>
-        <w:spacing w:before="0" w:after="0" w:line="480" w:lineRule="auto"/>
-        <w:ind w:firstLine="720"/>
-        <w:jc w:val="both"/>
-      </w:pPr>
-      <w:r>
-        <w:t>Create Coding Exercise (4.3) saves the "Exercise Details" as an "Exercise Record" in Coding Exercises (D9). Set Question Timer (4.4) saves the Admin's "Timer Settings" in Game Settings (D10).</w:t>
-      </w:r>
-    </w:p>
-    <w:p>
-      <w:pPr>
         <w:keepNext/>
         <w:pageBreakBefore/>
         <w:spacing w:before="0" w:after="0" w:line="240" w:lineRule="auto"/>
@@ -572,7 +452,7 @@
       <w:r>
         <w:drawing>
           <wp:inline xmlns:a="http://schemas.openxmlformats.org/drawingml/2006/main" xmlns:pic="http://schemas.openxmlformats.org/drawingml/2006/picture">
-            <wp:extent cx="5943600" cy="4155613"/>
+            <wp:extent cx="5641848" cy="5027570"/>
             <wp:docPr id="9" name="Picture 9"/>
             <wp:cNvGraphicFramePr>
               <a:graphicFrameLocks noChangeAspect="1"/>
@@ -593,7 +473,7 @@
                   <pic:spPr>
                     <a:xfrm>
                       <a:off x="0" y="0"/>
-                      <a:ext cx="5943600" cy="4155613"/>
+                      <a:ext cx="5641848" cy="5027570"/>
                     </a:xfrm>
                     <a:prstGeom prst="rect"/>
                   </pic:spPr>
@@ -615,16 +495,6 @@
       </w:r>
       <w:r>
         <w:t>Data Flow Diagram Level 1 - 5.0 Publish Content</w:t>
-      </w:r>
-    </w:p>
-    <w:p>
-      <w:pPr>
-        <w:spacing w:before="0" w:after="0" w:line="480" w:lineRule="auto"/>
-        <w:ind w:firstLine="720"/>
-        <w:jc w:val="both"/>
-      </w:pPr>
-      <w:r>
-        <w:t>This Level 1 Data Flow Diagram breaks down Publish Content (5.0). Preview Content (5.1) reads the "Lesson Content", "Activity Content" and "Exercise Content" from Lessons (D6), Learning Activities (D8) and Coding Exercises (D9) and returns a "Content Preview" to the Mentor or Admin who sent the "Content Preview Request". Only the Mentor can publish: Update Publish Status (5.2) applies the "Publishing Decision" to the "Checked Content" and saves the "Publishing Status" in the three data stores.</w:t>
       </w:r>
     </w:p>
     <w:p>
@@ -684,26 +554,6 @@
     </w:p>
     <w:p>
       <w:pPr>
-        <w:spacing w:before="0" w:after="0" w:line="480" w:lineRule="auto"/>
-        <w:ind w:firstLine="720"/>
-        <w:jc w:val="both"/>
-      </w:pPr>
-      <w:r>
-        <w:t>This Level 1 Data Flow Diagram breaks down Deliver Lessons and Activities (6.0). Display Lesson (6.1) uses the Learner's "Lesson Selection" and "Unlocked Lessons" to show the "Lesson Content" and "Video Link" from Lessons (D6) and Video Tutorials (D7), and saves the "Lesson Progress" in Learner Progress (D13).</w:t>
-      </w:r>
-    </w:p>
-    <w:p>
-      <w:pPr>
-        <w:spacing w:before="0" w:after="0" w:line="480" w:lineRule="auto"/>
-        <w:ind w:firstLine="720"/>
-        <w:jc w:val="both"/>
-      </w:pPr>
-      <w:r>
-        <w:t>Check Activity Answers (6.2) checks the "Activity Answers" against the "Published Activities" in Learning Activities (D8) within the "Timer Settings" from Game Settings (D10), returns "Answer Feedback" and saves the "Answer Record" in Learner Answers (D11). Check Exercise Code (6.3) checks the "Exercise Code" against the "Published Exercises" in Coding Exercises (D9), returns the "Exercise Result" and saves the "Submission Record" in Exercise Submissions (D12). Both also save the "Lesson Progress".</w:t>
-      </w:r>
-    </w:p>
-    <w:p>
-      <w:pPr>
         <w:keepNext/>
         <w:pageBreakBefore/>
         <w:spacing w:before="0" w:after="0" w:line="240" w:lineRule="auto"/>
@@ -712,7 +562,7 @@
       <w:r>
         <w:drawing>
           <wp:inline xmlns:a="http://schemas.openxmlformats.org/drawingml/2006/main" xmlns:pic="http://schemas.openxmlformats.org/drawingml/2006/picture">
-            <wp:extent cx="5943600" cy="2310831"/>
+            <wp:extent cx="5943600" cy="2332277"/>
             <wp:docPr id="11" name="Picture 11"/>
             <wp:cNvGraphicFramePr>
               <a:graphicFrameLocks noChangeAspect="1"/>
@@ -733,7 +583,7 @@
                   <pic:spPr>
                     <a:xfrm>
                       <a:off x="0" y="0"/>
-                      <a:ext cx="5943600" cy="2310831"/>
+                      <a:ext cx="5943600" cy="2332277"/>
                     </a:xfrm>
                     <a:prstGeom prst="rect"/>
                   </pic:spPr>
@@ -759,26 +609,6 @@
     </w:p>
     <w:p>
       <w:pPr>
-        <w:spacing w:before="0" w:after="0" w:line="480" w:lineRule="auto"/>
-        <w:ind w:firstLine="720"/>
-        <w:jc w:val="both"/>
-      </w:pPr>
-      <w:r>
-        <w:t>This Level 1 Data Flow Diagram breaks down Track Progress and Rewards (7.0). Compute Lesson Score (7.1) reads the "Answer Record" and "Submission Record" and passes the "Lesson Score" to Check Module Pass (7.2), which compares it with the "Lesson Progress" in Learner Progress (D13). A module passes at 80%: the "Unlocked Lessons" are saved, the "Passed Modules" go to Award Badges and Certificate (7.4), and the "Missed Items" go to Find Weak Spots (7.3).</w:t>
-      </w:r>
-    </w:p>
-    <w:p>
-      <w:pPr>
-        <w:spacing w:before="0" w:after="0" w:line="480" w:lineRule="auto"/>
-        <w:ind w:firstLine="720"/>
-        <w:jc w:val="both"/>
-      </w:pPr>
-      <w:r>
-        <w:t>Find Weak Spots (7.3) matches the "Missed Items" with the "Lesson Content", saves a "Recommendation Record" in Recommendations (D16), and gives the Learner a "Weak Spot Review" and the Mentor a "Recommendation Report". Award Badges and Certificate (7.4) compares the "Badge Rules" in Badges (D14), saves each "Earned Badge" and "Certificate Record", and shows the Learner their "Badges and Certificate". The Mentor's "Badge Details" are saved as "Badge Rules" by Define Badges (7.5).</w:t>
-      </w:r>
-    </w:p>
-    <w:p>
-      <w:pPr>
         <w:keepNext/>
         <w:pageBreakBefore/>
         <w:spacing w:before="0" w:after="0" w:line="240" w:lineRule="auto"/>
@@ -787,7 +617,7 @@
       <w:r>
         <w:drawing>
           <wp:inline xmlns:a="http://schemas.openxmlformats.org/drawingml/2006/main" xmlns:pic="http://schemas.openxmlformats.org/drawingml/2006/picture">
-            <wp:extent cx="5943600" cy="3979856"/>
+            <wp:extent cx="5413248" cy="3503981"/>
             <wp:docPr id="12" name="Picture 12"/>
             <wp:cNvGraphicFramePr>
               <a:graphicFrameLocks noChangeAspect="1"/>
@@ -808,7 +638,7 @@
                   <pic:spPr>
                     <a:xfrm>
                       <a:off x="0" y="0"/>
-                      <a:ext cx="5943600" cy="3979856"/>
+                      <a:ext cx="5413248" cy="3503981"/>
                     </a:xfrm>
                     <a:prstGeom prst="rect"/>
                   </pic:spPr>
@@ -834,26 +664,6 @@
     </w:p>
     <w:p>
       <w:pPr>
-        <w:spacing w:before="0" w:after="0" w:line="480" w:lineRule="auto"/>
-        <w:ind w:firstLine="720"/>
-        <w:jc w:val="both"/>
-      </w:pPr>
-      <w:r>
-        <w:t>This Level 1 Data Flow Diagram breaks down Manage Accounts (8.0). Update Account Status (8.1) applies the Admin's "Account Action", such as archive, restore or unlock, to the "Account Records" in Accounts (D1), returns the "Account Details", and writes an "Audit Log Entry" in Audit Logs (D18). Update Profile (8.4) saves the Learner's "Profile Changes" and returns the "Updated Profile".</w:t>
-      </w:r>
-    </w:p>
-    <w:p>
-      <w:pPr>
-        <w:spacing w:before="0" w:after="0" w:line="480" w:lineRule="auto"/>
-        <w:ind w:firstLine="720"/>
-        <w:jc w:val="both"/>
-      </w:pPr>
-      <w:r>
-        <w:t>A Mentor who cannot sign in sends a "Help Request" through Submit Help Request (8.2), which saves the "Help Request Record" in Help Requests (D17) and returns a "Request Confirmation". Resolve Help Request (8.3) shows the Admin the "Help Request List" and applies the "Help Request Decision": it saves the "Account Updates", gives the Admin a "Temporary Password" when the password is reset, updates the "Help Request Status", and writes an "Audit Log Entry".</w:t>
-      </w:r>
-    </w:p>
-    <w:p>
-      <w:pPr>
         <w:keepNext/>
         <w:pageBreakBefore/>
         <w:spacing w:before="0" w:after="0" w:line="240" w:lineRule="auto"/>
@@ -862,7 +672,7 @@
       <w:r>
         <w:drawing>
           <wp:inline xmlns:a="http://schemas.openxmlformats.org/drawingml/2006/main" xmlns:pic="http://schemas.openxmlformats.org/drawingml/2006/picture">
-            <wp:extent cx="5943600" cy="2467569"/>
+            <wp:extent cx="5943600" cy="2683625"/>
             <wp:docPr id="13" name="Picture 13"/>
             <wp:cNvGraphicFramePr>
               <a:graphicFrameLocks noChangeAspect="1"/>
@@ -883,7 +693,7 @@
                   <pic:spPr>
                     <a:xfrm>
                       <a:off x="0" y="0"/>
-                      <a:ext cx="5943600" cy="2467569"/>
+                      <a:ext cx="5943600" cy="2683625"/>
                     </a:xfrm>
                     <a:prstGeom prst="rect"/>
                   </pic:spPr>
@@ -905,16 +715,6 @@
       </w:r>
       <w:r>
         <w:t>Data Flow Diagram Level 1 - 9.0 Generate Reports</w:t>
-      </w:r>
-    </w:p>
-    <w:p>
-      <w:pPr>
-        <w:spacing w:before="0" w:after="0" w:line="480" w:lineRule="auto"/>
-        <w:ind w:firstLine="720"/>
-        <w:jc w:val="both"/>
-      </w:pPr>
-      <w:r>
-        <w:t>This Level 1 Data Flow Diagram breaks down Generate Reports (9.0). Generate Progress Report (9.1) uses the "Report Filters" from the Mentor or Admin with the "Lesson Progress" and "Answer Record" to produce the "Learner Progress Report". Generate System Report (9.2) uses the Admin's "Report Filters" with the "Account Records", "Login Record", "Certificate Record" and "Audit Log Entry" to produce the "System Report".</w:t>
       </w:r>
     </w:p>
     <w:sectPr>

</xml_diff>

<commit_message>
Straight lines in the Context Diagram and Level 1 DFDs
The Context Diagram is laid out by hand (Admin left, Mentor right, Learner
below) with a straight pair of arrows to each user, and every Level 1 draws
its users and data stores next to the sub-process that uses them.

Co-Authored-By: Claude Opus 5.5 <noreply@anthropic.com>
Claude-Session: https://claude.ai/code/session_0197sgxmB7VL2gdQVtM7kWoL
</commit_message>
<xml_diff>
--- a/docs/CobraByte_Context_Diagram_and_DFD.docx
+++ b/docs/CobraByte_Context_Diagram_and_DFD.docx
@@ -12,7 +12,7 @@
       <w:r>
         <w:drawing>
           <wp:inline xmlns:a="http://schemas.openxmlformats.org/drawingml/2006/main" xmlns:pic="http://schemas.openxmlformats.org/drawingml/2006/picture">
-            <wp:extent cx="5724144" cy="4930445"/>
+            <wp:extent cx="5943599" cy="2880604"/>
             <wp:docPr id="1" name="Picture 1"/>
             <wp:cNvGraphicFramePr>
               <a:graphicFrameLocks noChangeAspect="1"/>
@@ -33,7 +33,7 @@
                   <pic:spPr>
                     <a:xfrm>
                       <a:off x="0" y="0"/>
-                      <a:ext cx="5724144" cy="4930445"/>
+                      <a:ext cx="5943599" cy="2880604"/>
                     </a:xfrm>
                     <a:prstGeom prst="rect"/>
                   </pic:spPr>
@@ -232,7 +232,7 @@
       <w:r>
         <w:drawing>
           <wp:inline xmlns:a="http://schemas.openxmlformats.org/drawingml/2006/main" xmlns:pic="http://schemas.openxmlformats.org/drawingml/2006/picture">
-            <wp:extent cx="5550408" cy="5027543"/>
+            <wp:extent cx="5943600" cy="1714500"/>
             <wp:docPr id="5" name="Picture 5"/>
             <wp:cNvGraphicFramePr>
               <a:graphicFrameLocks noChangeAspect="1"/>
@@ -253,7 +253,7 @@
                   <pic:spPr>
                     <a:xfrm>
                       <a:off x="0" y="0"/>
-                      <a:ext cx="5550408" cy="5027543"/>
+                      <a:ext cx="5943600" cy="1714500"/>
                     </a:xfrm>
                     <a:prstGeom prst="rect"/>
                   </pic:spPr>
@@ -342,7 +342,7 @@
       <w:r>
         <w:drawing>
           <wp:inline xmlns:a="http://schemas.openxmlformats.org/drawingml/2006/main" xmlns:pic="http://schemas.openxmlformats.org/drawingml/2006/picture">
-            <wp:extent cx="5943599" cy="3493420"/>
+            <wp:extent cx="5943599" cy="4203281"/>
             <wp:docPr id="7" name="Picture 7"/>
             <wp:cNvGraphicFramePr>
               <a:graphicFrameLocks noChangeAspect="1"/>
@@ -363,7 +363,7 @@
                   <pic:spPr>
                     <a:xfrm>
                       <a:off x="0" y="0"/>
-                      <a:ext cx="5943599" cy="3493420"/>
+                      <a:ext cx="5943599" cy="4203281"/>
                     </a:xfrm>
                     <a:prstGeom prst="rect"/>
                   </pic:spPr>
@@ -397,7 +397,7 @@
       <w:r>
         <w:drawing>
           <wp:inline xmlns:a="http://schemas.openxmlformats.org/drawingml/2006/main" xmlns:pic="http://schemas.openxmlformats.org/drawingml/2006/picture">
-            <wp:extent cx="5943600" cy="3947832"/>
+            <wp:extent cx="5943600" cy="2644996"/>
             <wp:docPr id="8" name="Picture 8"/>
             <wp:cNvGraphicFramePr>
               <a:graphicFrameLocks noChangeAspect="1"/>
@@ -418,7 +418,7 @@
                   <pic:spPr>
                     <a:xfrm>
                       <a:off x="0" y="0"/>
-                      <a:ext cx="5943600" cy="3947832"/>
+                      <a:ext cx="5943600" cy="2644996"/>
                     </a:xfrm>
                     <a:prstGeom prst="rect"/>
                   </pic:spPr>
@@ -452,7 +452,7 @@
       <w:r>
         <w:drawing>
           <wp:inline xmlns:a="http://schemas.openxmlformats.org/drawingml/2006/main" xmlns:pic="http://schemas.openxmlformats.org/drawingml/2006/picture">
-            <wp:extent cx="5641848" cy="5027570"/>
+            <wp:extent cx="5943600" cy="1951500"/>
             <wp:docPr id="9" name="Picture 9"/>
             <wp:cNvGraphicFramePr>
               <a:graphicFrameLocks noChangeAspect="1"/>
@@ -473,7 +473,7 @@
                   <pic:spPr>
                     <a:xfrm>
                       <a:off x="0" y="0"/>
-                      <a:ext cx="5641848" cy="5027570"/>
+                      <a:ext cx="5943600" cy="1951500"/>
                     </a:xfrm>
                     <a:prstGeom prst="rect"/>
                   </pic:spPr>
@@ -617,7 +617,7 @@
       <w:r>
         <w:drawing>
           <wp:inline xmlns:a="http://schemas.openxmlformats.org/drawingml/2006/main" xmlns:pic="http://schemas.openxmlformats.org/drawingml/2006/picture">
-            <wp:extent cx="5413248" cy="3503981"/>
+            <wp:extent cx="5943600" cy="1985484"/>
             <wp:docPr id="12" name="Picture 12"/>
             <wp:cNvGraphicFramePr>
               <a:graphicFrameLocks noChangeAspect="1"/>
@@ -638,7 +638,7 @@
                   <pic:spPr>
                     <a:xfrm>
                       <a:off x="0" y="0"/>
-                      <a:ext cx="5413248" cy="3503981"/>
+                      <a:ext cx="5943600" cy="1985484"/>
                     </a:xfrm>
                     <a:prstGeom prst="rect"/>
                   </pic:spPr>
@@ -672,7 +672,7 @@
       <w:r>
         <w:drawing>
           <wp:inline xmlns:a="http://schemas.openxmlformats.org/drawingml/2006/main" xmlns:pic="http://schemas.openxmlformats.org/drawingml/2006/picture">
-            <wp:extent cx="5943600" cy="2683625"/>
+            <wp:extent cx="5943600" cy="2956076"/>
             <wp:docPr id="13" name="Picture 13"/>
             <wp:cNvGraphicFramePr>
               <a:graphicFrameLocks noChangeAspect="1"/>
@@ -693,7 +693,7 @@
                   <pic:spPr>
                     <a:xfrm>
                       <a:off x="0" y="0"/>
-                      <a:ext cx="5943600" cy="2683625"/>
+                      <a:ext cx="5943600" cy="2956076"/>
                     </a:xfrm>
                     <a:prstGeom prst="rect"/>
                   </pic:spPr>

</xml_diff>

<commit_message>
Straight-line layout for Level 0 and Level 1 DFDs
Processes sit in one column with their users on the left and data stores
on the right, so every line to a user or store is straight; flows between
processes run straight down, and one that skips ahead uses a lane beside
the column. Each page is portrait or landscape, whichever shows its
diagram larger.

Co-Authored-By: Claude Opus 5.5 <noreply@anthropic.com>
Claude-Session: https://claude.ai/code/session_0197sgxmB7VL2gdQVtM7kWoL
</commit_message>
<xml_diff>
--- a/docs/CobraByte_Context_Diagram_and_DFD.docx
+++ b/docs/CobraByte_Context_Diagram_and_DFD.docx
@@ -5,14 +5,13 @@
     <w:p>
       <w:pPr>
         <w:keepNext/>
-        <w:pageBreakBefore w:val="0"/>
         <w:spacing w:before="0" w:after="0" w:line="240" w:lineRule="auto"/>
         <w:jc w:val="center"/>
       </w:pPr>
       <w:r>
         <w:drawing>
           <wp:inline xmlns:a="http://schemas.openxmlformats.org/drawingml/2006/main" xmlns:pic="http://schemas.openxmlformats.org/drawingml/2006/picture">
-            <wp:extent cx="5943599" cy="2880604"/>
+            <wp:extent cx="7507224" cy="3638426"/>
             <wp:docPr id="1" name="Picture 1"/>
             <wp:cNvGraphicFramePr>
               <a:graphicFrameLocks noChangeAspect="1"/>
@@ -33,7 +32,7 @@
                   <pic:spPr>
                     <a:xfrm>
                       <a:off x="0" y="0"/>
-                      <a:ext cx="5943599" cy="2880604"/>
+                      <a:ext cx="7507224" cy="3638426"/>
                     </a:xfrm>
                     <a:prstGeom prst="rect"/>
                   </pic:spPr>
@@ -59,15 +58,24 @@
     </w:p>
     <w:p>
       <w:pPr>
+        <w:sectPr>
+          <w:pgSz w:w="15840" w:h="12240" w:orient="landscape"/>
+          <w:pgMar w:top="1440" w:right="1440" w:bottom="1440" w:left="1440" w:header="720" w:footer="720" w:gutter="0"/>
+          <w:cols w:space="720"/>
+          <w:docGrid w:linePitch="360"/>
+        </w:sectPr>
+      </w:pPr>
+    </w:p>
+    <w:p>
+      <w:pPr>
         <w:keepNext/>
-        <w:pageBreakBefore/>
         <w:spacing w:before="0" w:after="0" w:line="240" w:lineRule="auto"/>
         <w:jc w:val="center"/>
       </w:pPr>
       <w:r>
         <w:drawing>
           <wp:inline xmlns:a="http://schemas.openxmlformats.org/drawingml/2006/main" xmlns:pic="http://schemas.openxmlformats.org/drawingml/2006/picture">
-            <wp:extent cx="5109547" cy="6947890"/>
+            <wp:extent cx="5557031" cy="6950699"/>
             <wp:docPr id="2" name="Picture 2"/>
             <wp:cNvGraphicFramePr>
               <a:graphicFrameLocks noChangeAspect="1"/>
@@ -88,7 +96,7 @@
                   <pic:spPr>
                     <a:xfrm>
                       <a:off x="0" y="0"/>
-                      <a:ext cx="5109547" cy="6947890"/>
+                      <a:ext cx="5557031" cy="6950699"/>
                     </a:xfrm>
                     <a:prstGeom prst="rect"/>
                   </pic:spPr>
@@ -114,15 +122,24 @@
     </w:p>
     <w:p>
       <w:pPr>
+        <w:sectPr>
+          <w:pgSz w:w="12240" w:h="15840"/>
+          <w:pgMar w:top="1440" w:right="1440" w:bottom="1440" w:left="1440" w:header="720" w:footer="720" w:gutter="0"/>
+          <w:cols w:space="720"/>
+          <w:docGrid w:linePitch="360"/>
+        </w:sectPr>
+      </w:pPr>
+    </w:p>
+    <w:p>
+      <w:pPr>
         <w:keepNext/>
-        <w:pageBreakBefore/>
         <w:spacing w:before="0" w:after="0" w:line="240" w:lineRule="auto"/>
         <w:jc w:val="center"/>
       </w:pPr>
       <w:r>
         <w:drawing>
           <wp:inline xmlns:a="http://schemas.openxmlformats.org/drawingml/2006/main" xmlns:pic="http://schemas.openxmlformats.org/drawingml/2006/picture">
-            <wp:extent cx="5943600" cy="5917451"/>
+            <wp:extent cx="5943600" cy="5279393"/>
             <wp:docPr id="3" name="Picture 3"/>
             <wp:cNvGraphicFramePr>
               <a:graphicFrameLocks noChangeAspect="1"/>
@@ -143,7 +160,7 @@
                   <pic:spPr>
                     <a:xfrm>
                       <a:off x="0" y="0"/>
-                      <a:ext cx="5943600" cy="5917451"/>
+                      <a:ext cx="5943600" cy="5279393"/>
                     </a:xfrm>
                     <a:prstGeom prst="rect"/>
                   </pic:spPr>
@@ -169,15 +186,24 @@
     </w:p>
     <w:p>
       <w:pPr>
+        <w:sectPr>
+          <w:pgSz w:w="12240" w:h="15840"/>
+          <w:pgMar w:top="1440" w:right="1440" w:bottom="1440" w:left="1440" w:header="720" w:footer="720" w:gutter="0"/>
+          <w:cols w:space="720"/>
+          <w:docGrid w:linePitch="360"/>
+        </w:sectPr>
+      </w:pPr>
+    </w:p>
+    <w:p>
+      <w:pPr>
         <w:keepNext/>
-        <w:pageBreakBefore/>
         <w:spacing w:before="0" w:after="0" w:line="240" w:lineRule="auto"/>
         <w:jc w:val="center"/>
       </w:pPr>
       <w:r>
         <w:drawing>
           <wp:inline xmlns:a="http://schemas.openxmlformats.org/drawingml/2006/main" xmlns:pic="http://schemas.openxmlformats.org/drawingml/2006/picture">
-            <wp:extent cx="5943600" cy="3935344"/>
+            <wp:extent cx="8133695" cy="4662396"/>
             <wp:docPr id="4" name="Picture 4"/>
             <wp:cNvGraphicFramePr>
               <a:graphicFrameLocks noChangeAspect="1"/>
@@ -198,7 +224,7 @@
                   <pic:spPr>
                     <a:xfrm>
                       <a:off x="0" y="0"/>
-                      <a:ext cx="5943600" cy="3935344"/>
+                      <a:ext cx="8133695" cy="4662396"/>
                     </a:xfrm>
                     <a:prstGeom prst="rect"/>
                   </pic:spPr>
@@ -224,15 +250,24 @@
     </w:p>
     <w:p>
       <w:pPr>
+        <w:sectPr>
+          <w:pgSz w:w="15840" w:h="12240" w:orient="landscape"/>
+          <w:pgMar w:top="1440" w:right="1440" w:bottom="1440" w:left="1440" w:header="720" w:footer="720" w:gutter="0"/>
+          <w:cols w:space="720"/>
+          <w:docGrid w:linePitch="360"/>
+        </w:sectPr>
+      </w:pPr>
+    </w:p>
+    <w:p>
+      <w:pPr>
         <w:keepNext/>
-        <w:pageBreakBefore/>
         <w:spacing w:before="0" w:after="0" w:line="240" w:lineRule="auto"/>
         <w:jc w:val="center"/>
       </w:pPr>
       <w:r>
         <w:drawing>
           <wp:inline xmlns:a="http://schemas.openxmlformats.org/drawingml/2006/main" xmlns:pic="http://schemas.openxmlformats.org/drawingml/2006/picture">
-            <wp:extent cx="5943600" cy="1714500"/>
+            <wp:extent cx="7050024" cy="3638368"/>
             <wp:docPr id="5" name="Picture 5"/>
             <wp:cNvGraphicFramePr>
               <a:graphicFrameLocks noChangeAspect="1"/>
@@ -253,7 +288,7 @@
                   <pic:spPr>
                     <a:xfrm>
                       <a:off x="0" y="0"/>
-                      <a:ext cx="5943600" cy="1714500"/>
+                      <a:ext cx="7050024" cy="3638368"/>
                     </a:xfrm>
                     <a:prstGeom prst="rect"/>
                   </pic:spPr>
@@ -279,15 +314,24 @@
     </w:p>
     <w:p>
       <w:pPr>
+        <w:sectPr>
+          <w:pgSz w:w="15840" w:h="12240" w:orient="landscape"/>
+          <w:pgMar w:top="1440" w:right="1440" w:bottom="1440" w:left="1440" w:header="720" w:footer="720" w:gutter="0"/>
+          <w:cols w:space="720"/>
+          <w:docGrid w:linePitch="360"/>
+        </w:sectPr>
+      </w:pPr>
+    </w:p>
+    <w:p>
+      <w:pPr>
         <w:keepNext/>
-        <w:pageBreakBefore/>
         <w:spacing w:before="0" w:after="0" w:line="240" w:lineRule="auto"/>
         <w:jc w:val="center"/>
       </w:pPr>
       <w:r>
         <w:drawing>
           <wp:inline xmlns:a="http://schemas.openxmlformats.org/drawingml/2006/main" xmlns:pic="http://schemas.openxmlformats.org/drawingml/2006/picture">
-            <wp:extent cx="5943600" cy="3061854"/>
+            <wp:extent cx="6894968" cy="4662208"/>
             <wp:docPr id="6" name="Picture 6"/>
             <wp:cNvGraphicFramePr>
               <a:graphicFrameLocks noChangeAspect="1"/>
@@ -308,7 +352,7 @@
                   <pic:spPr>
                     <a:xfrm>
                       <a:off x="0" y="0"/>
-                      <a:ext cx="5943600" cy="3061854"/>
+                      <a:ext cx="6894968" cy="4662208"/>
                     </a:xfrm>
                     <a:prstGeom prst="rect"/>
                   </pic:spPr>
@@ -334,15 +378,24 @@
     </w:p>
     <w:p>
       <w:pPr>
+        <w:sectPr>
+          <w:pgSz w:w="15840" w:h="12240" w:orient="landscape"/>
+          <w:pgMar w:top="1440" w:right="1440" w:bottom="1440" w:left="1440" w:header="720" w:footer="720" w:gutter="0"/>
+          <w:cols w:space="720"/>
+          <w:docGrid w:linePitch="360"/>
+        </w:sectPr>
+      </w:pPr>
+    </w:p>
+    <w:p>
+      <w:pPr>
         <w:keepNext/>
-        <w:pageBreakBefore/>
         <w:spacing w:before="0" w:after="0" w:line="240" w:lineRule="auto"/>
         <w:jc w:val="center"/>
       </w:pPr>
       <w:r>
         <w:drawing>
           <wp:inline xmlns:a="http://schemas.openxmlformats.org/drawingml/2006/main" xmlns:pic="http://schemas.openxmlformats.org/drawingml/2006/picture">
-            <wp:extent cx="5943599" cy="4203281"/>
+            <wp:extent cx="6976872" cy="4461102"/>
             <wp:docPr id="7" name="Picture 7"/>
             <wp:cNvGraphicFramePr>
               <a:graphicFrameLocks noChangeAspect="1"/>
@@ -363,7 +416,7 @@
                   <pic:spPr>
                     <a:xfrm>
                       <a:off x="0" y="0"/>
-                      <a:ext cx="5943599" cy="4203281"/>
+                      <a:ext cx="6976872" cy="4461102"/>
                     </a:xfrm>
                     <a:prstGeom prst="rect"/>
                   </pic:spPr>
@@ -389,15 +442,24 @@
     </w:p>
     <w:p>
       <w:pPr>
+        <w:sectPr>
+          <w:pgSz w:w="15840" w:h="12240" w:orient="landscape"/>
+          <w:pgMar w:top="1440" w:right="1440" w:bottom="1440" w:left="1440" w:header="720" w:footer="720" w:gutter="0"/>
+          <w:cols w:space="720"/>
+          <w:docGrid w:linePitch="360"/>
+        </w:sectPr>
+      </w:pPr>
+    </w:p>
+    <w:p>
+      <w:pPr>
         <w:keepNext/>
-        <w:pageBreakBefore/>
         <w:spacing w:before="0" w:after="0" w:line="240" w:lineRule="auto"/>
         <w:jc w:val="center"/>
       </w:pPr>
       <w:r>
         <w:drawing>
           <wp:inline xmlns:a="http://schemas.openxmlformats.org/drawingml/2006/main" xmlns:pic="http://schemas.openxmlformats.org/drawingml/2006/picture">
-            <wp:extent cx="5943600" cy="2644996"/>
+            <wp:extent cx="7148800" cy="4662261"/>
             <wp:docPr id="8" name="Picture 8"/>
             <wp:cNvGraphicFramePr>
               <a:graphicFrameLocks noChangeAspect="1"/>
@@ -418,7 +480,7 @@
                   <pic:spPr>
                     <a:xfrm>
                       <a:off x="0" y="0"/>
-                      <a:ext cx="5943600" cy="2644996"/>
+                      <a:ext cx="7148800" cy="4662261"/>
                     </a:xfrm>
                     <a:prstGeom prst="rect"/>
                   </pic:spPr>
@@ -444,15 +506,24 @@
     </w:p>
     <w:p>
       <w:pPr>
+        <w:sectPr>
+          <w:pgSz w:w="15840" w:h="12240" w:orient="landscape"/>
+          <w:pgMar w:top="1440" w:right="1440" w:bottom="1440" w:left="1440" w:header="720" w:footer="720" w:gutter="0"/>
+          <w:cols w:space="720"/>
+          <w:docGrid w:linePitch="360"/>
+        </w:sectPr>
+      </w:pPr>
+    </w:p>
+    <w:p>
+      <w:pPr>
         <w:keepNext/>
-        <w:pageBreakBefore/>
         <w:spacing w:before="0" w:after="0" w:line="240" w:lineRule="auto"/>
         <w:jc w:val="center"/>
       </w:pPr>
       <w:r>
         <w:drawing>
           <wp:inline xmlns:a="http://schemas.openxmlformats.org/drawingml/2006/main" xmlns:pic="http://schemas.openxmlformats.org/drawingml/2006/picture">
-            <wp:extent cx="5943600" cy="1951500"/>
+            <wp:extent cx="7461504" cy="3255264"/>
             <wp:docPr id="9" name="Picture 9"/>
             <wp:cNvGraphicFramePr>
               <a:graphicFrameLocks noChangeAspect="1"/>
@@ -473,7 +544,7 @@
                   <pic:spPr>
                     <a:xfrm>
                       <a:off x="0" y="0"/>
-                      <a:ext cx="5943600" cy="1951500"/>
+                      <a:ext cx="7461504" cy="3255264"/>
                     </a:xfrm>
                     <a:prstGeom prst="rect"/>
                   </pic:spPr>
@@ -499,15 +570,24 @@
     </w:p>
     <w:p>
       <w:pPr>
+        <w:sectPr>
+          <w:pgSz w:w="15840" w:h="12240" w:orient="landscape"/>
+          <w:pgMar w:top="1440" w:right="1440" w:bottom="1440" w:left="1440" w:header="720" w:footer="720" w:gutter="0"/>
+          <w:cols w:space="720"/>
+          <w:docGrid w:linePitch="360"/>
+        </w:sectPr>
+      </w:pPr>
+    </w:p>
+    <w:p>
+      <w:pPr>
         <w:keepNext/>
-        <w:pageBreakBefore/>
         <w:spacing w:before="0" w:after="0" w:line="240" w:lineRule="auto"/>
         <w:jc w:val="center"/>
       </w:pPr>
       <w:r>
         <w:drawing>
           <wp:inline xmlns:a="http://schemas.openxmlformats.org/drawingml/2006/main" xmlns:pic="http://schemas.openxmlformats.org/drawingml/2006/picture">
-            <wp:extent cx="5943600" cy="4418124"/>
+            <wp:extent cx="7186284" cy="4665139"/>
             <wp:docPr id="10" name="Picture 10"/>
             <wp:cNvGraphicFramePr>
               <a:graphicFrameLocks noChangeAspect="1"/>
@@ -528,7 +608,7 @@
                   <pic:spPr>
                     <a:xfrm>
                       <a:off x="0" y="0"/>
-                      <a:ext cx="5943600" cy="4418124"/>
+                      <a:ext cx="7186284" cy="4665139"/>
                     </a:xfrm>
                     <a:prstGeom prst="rect"/>
                   </pic:spPr>
@@ -554,15 +634,24 @@
     </w:p>
     <w:p>
       <w:pPr>
+        <w:sectPr>
+          <w:pgSz w:w="15840" w:h="12240" w:orient="landscape"/>
+          <w:pgMar w:top="1440" w:right="1440" w:bottom="1440" w:left="1440" w:header="720" w:footer="720" w:gutter="0"/>
+          <w:cols w:space="720"/>
+          <w:docGrid w:linePitch="360"/>
+        </w:sectPr>
+      </w:pPr>
+    </w:p>
+    <w:p>
+      <w:pPr>
         <w:keepNext/>
-        <w:pageBreakBefore/>
         <w:spacing w:before="0" w:after="0" w:line="240" w:lineRule="auto"/>
         <w:jc w:val="center"/>
       </w:pPr>
       <w:r>
         <w:drawing>
           <wp:inline xmlns:a="http://schemas.openxmlformats.org/drawingml/2006/main" xmlns:pic="http://schemas.openxmlformats.org/drawingml/2006/picture">
-            <wp:extent cx="5943600" cy="2332277"/>
+            <wp:extent cx="5943600" cy="4449134"/>
             <wp:docPr id="11" name="Picture 11"/>
             <wp:cNvGraphicFramePr>
               <a:graphicFrameLocks noChangeAspect="1"/>
@@ -583,7 +672,7 @@
                   <pic:spPr>
                     <a:xfrm>
                       <a:off x="0" y="0"/>
-                      <a:ext cx="5943600" cy="2332277"/>
+                      <a:ext cx="5943600" cy="4449134"/>
                     </a:xfrm>
                     <a:prstGeom prst="rect"/>
                   </pic:spPr>
@@ -609,15 +698,24 @@
     </w:p>
     <w:p>
       <w:pPr>
+        <w:sectPr>
+          <w:pgSz w:w="12240" w:h="15840"/>
+          <w:pgMar w:top="1440" w:right="1440" w:bottom="1440" w:left="1440" w:header="720" w:footer="720" w:gutter="0"/>
+          <w:cols w:space="720"/>
+          <w:docGrid w:linePitch="360"/>
+        </w:sectPr>
+      </w:pPr>
+    </w:p>
+    <w:p>
+      <w:pPr>
         <w:keepNext/>
-        <w:pageBreakBefore/>
         <w:spacing w:before="0" w:after="0" w:line="240" w:lineRule="auto"/>
         <w:jc w:val="center"/>
       </w:pPr>
       <w:r>
         <w:drawing>
           <wp:inline xmlns:a="http://schemas.openxmlformats.org/drawingml/2006/main" xmlns:pic="http://schemas.openxmlformats.org/drawingml/2006/picture">
-            <wp:extent cx="5943600" cy="1985484"/>
+            <wp:extent cx="6830568" cy="2442623"/>
             <wp:docPr id="12" name="Picture 12"/>
             <wp:cNvGraphicFramePr>
               <a:graphicFrameLocks noChangeAspect="1"/>
@@ -638,7 +736,7 @@
                   <pic:spPr>
                     <a:xfrm>
                       <a:off x="0" y="0"/>
-                      <a:ext cx="5943600" cy="1985484"/>
+                      <a:ext cx="6830568" cy="2442623"/>
                     </a:xfrm>
                     <a:prstGeom prst="rect"/>
                   </pic:spPr>
@@ -664,15 +762,24 @@
     </w:p>
     <w:p>
       <w:pPr>
+        <w:sectPr>
+          <w:pgSz w:w="15840" w:h="12240" w:orient="landscape"/>
+          <w:pgMar w:top="1440" w:right="1440" w:bottom="1440" w:left="1440" w:header="720" w:footer="720" w:gutter="0"/>
+          <w:cols w:space="720"/>
+          <w:docGrid w:linePitch="360"/>
+        </w:sectPr>
+      </w:pPr>
+    </w:p>
+    <w:p>
+      <w:pPr>
         <w:keepNext/>
-        <w:pageBreakBefore/>
         <w:spacing w:before="0" w:after="0" w:line="240" w:lineRule="auto"/>
         <w:jc w:val="center"/>
       </w:pPr>
       <w:r>
         <w:drawing>
           <wp:inline xmlns:a="http://schemas.openxmlformats.org/drawingml/2006/main" xmlns:pic="http://schemas.openxmlformats.org/drawingml/2006/picture">
-            <wp:extent cx="5943600" cy="2956076"/>
+            <wp:extent cx="8165592" cy="3473942"/>
             <wp:docPr id="13" name="Picture 13"/>
             <wp:cNvGraphicFramePr>
               <a:graphicFrameLocks noChangeAspect="1"/>
@@ -693,7 +800,7 @@
                   <pic:spPr>
                     <a:xfrm>
                       <a:off x="0" y="0"/>
-                      <a:ext cx="5943600" cy="2956076"/>
+                      <a:ext cx="8165592" cy="3473942"/>
                     </a:xfrm>
                     <a:prstGeom prst="rect"/>
                   </pic:spPr>
@@ -718,7 +825,7 @@
       </w:r>
     </w:p>
     <w:sectPr>
-      <w:pgSz w:w="12240" w:h="15840"/>
+      <w:pgSz w:w="15840" w:h="12240" w:orient="landscape"/>
       <w:pgMar w:top="1440" w:right="1440" w:bottom="1440" w:left="1440" w:header="720" w:footer="720" w:gutter="0"/>
       <w:cols w:space="720"/>
       <w:docGrid w:linePitch="360"/>

</xml_diff>

<commit_message>
Draw each user once per DFD
Learner, Mentor and Admin appear once in every diagram, placed above,
below or between their processes, wherever the fewest lines cross; an
unavoidable crossing is drawn with a hop. Data stores are still drawn
next to each process that uses them. The drawing check now reads every
flow line and the renderer reports line crossings.

Co-Authored-By: Claude Opus 5.5 <noreply@anthropic.com>
Claude-Session: https://claude.ai/code/session_0197sgxmB7VL2gdQVtM7kWoL
</commit_message>
<xml_diff>
--- a/docs/CobraByte_Context_Diagram_and_DFD.docx
+++ b/docs/CobraByte_Context_Diagram_and_DFD.docx
@@ -75,7 +75,7 @@
       <w:r>
         <w:drawing>
           <wp:inline xmlns:a="http://schemas.openxmlformats.org/drawingml/2006/main" xmlns:pic="http://schemas.openxmlformats.org/drawingml/2006/picture">
-            <wp:extent cx="5557031" cy="6950699"/>
+            <wp:extent cx="5943600" cy="6683784"/>
             <wp:docPr id="2" name="Picture 2"/>
             <wp:cNvGraphicFramePr>
               <a:graphicFrameLocks noChangeAspect="1"/>
@@ -96,7 +96,7 @@
                   <pic:spPr>
                     <a:xfrm>
                       <a:off x="0" y="0"/>
-                      <a:ext cx="5557031" cy="6950699"/>
+                      <a:ext cx="5943600" cy="6683784"/>
                     </a:xfrm>
                     <a:prstGeom prst="rect"/>
                   </pic:spPr>
@@ -139,7 +139,7 @@
       <w:r>
         <w:drawing>
           <wp:inline xmlns:a="http://schemas.openxmlformats.org/drawingml/2006/main" xmlns:pic="http://schemas.openxmlformats.org/drawingml/2006/picture">
-            <wp:extent cx="5943600" cy="5279393"/>
+            <wp:extent cx="5943600" cy="5094840"/>
             <wp:docPr id="3" name="Picture 3"/>
             <wp:cNvGraphicFramePr>
               <a:graphicFrameLocks noChangeAspect="1"/>
@@ -160,7 +160,7 @@
                   <pic:spPr>
                     <a:xfrm>
                       <a:off x="0" y="0"/>
-                      <a:ext cx="5943600" cy="5279393"/>
+                      <a:ext cx="5943600" cy="5094840"/>
                     </a:xfrm>
                     <a:prstGeom prst="rect"/>
                   </pic:spPr>
@@ -203,7 +203,7 @@
       <w:r>
         <w:drawing>
           <wp:inline xmlns:a="http://schemas.openxmlformats.org/drawingml/2006/main" xmlns:pic="http://schemas.openxmlformats.org/drawingml/2006/picture">
-            <wp:extent cx="8133695" cy="4662396"/>
+            <wp:extent cx="8042293" cy="4664094"/>
             <wp:docPr id="4" name="Picture 4"/>
             <wp:cNvGraphicFramePr>
               <a:graphicFrameLocks noChangeAspect="1"/>
@@ -224,7 +224,7 @@
                   <pic:spPr>
                     <a:xfrm>
                       <a:off x="0" y="0"/>
-                      <a:ext cx="8133695" cy="4662396"/>
+                      <a:ext cx="8042293" cy="4664094"/>
                     </a:xfrm>
                     <a:prstGeom prst="rect"/>
                   </pic:spPr>
@@ -267,7 +267,7 @@
       <w:r>
         <w:drawing>
           <wp:inline xmlns:a="http://schemas.openxmlformats.org/drawingml/2006/main" xmlns:pic="http://schemas.openxmlformats.org/drawingml/2006/picture">
-            <wp:extent cx="7050024" cy="3638368"/>
+            <wp:extent cx="8229600" cy="4425487"/>
             <wp:docPr id="5" name="Picture 5"/>
             <wp:cNvGraphicFramePr>
               <a:graphicFrameLocks noChangeAspect="1"/>
@@ -288,7 +288,7 @@
                   <pic:spPr>
                     <a:xfrm>
                       <a:off x="0" y="0"/>
-                      <a:ext cx="7050024" cy="3638368"/>
+                      <a:ext cx="8229600" cy="4425487"/>
                     </a:xfrm>
                     <a:prstGeom prst="rect"/>
                   </pic:spPr>
@@ -331,7 +331,7 @@
       <w:r>
         <w:drawing>
           <wp:inline xmlns:a="http://schemas.openxmlformats.org/drawingml/2006/main" xmlns:pic="http://schemas.openxmlformats.org/drawingml/2006/picture">
-            <wp:extent cx="6894968" cy="4662208"/>
+            <wp:extent cx="8229600" cy="3403312"/>
             <wp:docPr id="6" name="Picture 6"/>
             <wp:cNvGraphicFramePr>
               <a:graphicFrameLocks noChangeAspect="1"/>
@@ -352,7 +352,7 @@
                   <pic:spPr>
                     <a:xfrm>
                       <a:off x="0" y="0"/>
-                      <a:ext cx="6894968" cy="4662208"/>
+                      <a:ext cx="8229600" cy="3403312"/>
                     </a:xfrm>
                     <a:prstGeom prst="rect"/>
                   </pic:spPr>
@@ -395,7 +395,7 @@
       <w:r>
         <w:drawing>
           <wp:inline xmlns:a="http://schemas.openxmlformats.org/drawingml/2006/main" xmlns:pic="http://schemas.openxmlformats.org/drawingml/2006/picture">
-            <wp:extent cx="6976872" cy="4461102"/>
+            <wp:extent cx="6295643" cy="4662248"/>
             <wp:docPr id="7" name="Picture 7"/>
             <wp:cNvGraphicFramePr>
               <a:graphicFrameLocks noChangeAspect="1"/>
@@ -416,7 +416,7 @@
                   <pic:spPr>
                     <a:xfrm>
                       <a:off x="0" y="0"/>
-                      <a:ext cx="6976872" cy="4461102"/>
+                      <a:ext cx="6295643" cy="4662248"/>
                     </a:xfrm>
                     <a:prstGeom prst="rect"/>
                   </pic:spPr>
@@ -459,7 +459,7 @@
       <w:r>
         <w:drawing>
           <wp:inline xmlns:a="http://schemas.openxmlformats.org/drawingml/2006/main" xmlns:pic="http://schemas.openxmlformats.org/drawingml/2006/picture">
-            <wp:extent cx="7148800" cy="4662261"/>
+            <wp:extent cx="7140892" cy="4662438"/>
             <wp:docPr id="8" name="Picture 8"/>
             <wp:cNvGraphicFramePr>
               <a:graphicFrameLocks noChangeAspect="1"/>
@@ -480,7 +480,7 @@
                   <pic:spPr>
                     <a:xfrm>
                       <a:off x="0" y="0"/>
-                      <a:ext cx="7148800" cy="4662261"/>
+                      <a:ext cx="7140892" cy="4662438"/>
                     </a:xfrm>
                     <a:prstGeom prst="rect"/>
                   </pic:spPr>
@@ -587,7 +587,7 @@
       <w:r>
         <w:drawing>
           <wp:inline xmlns:a="http://schemas.openxmlformats.org/drawingml/2006/main" xmlns:pic="http://schemas.openxmlformats.org/drawingml/2006/picture">
-            <wp:extent cx="7186284" cy="4665139"/>
+            <wp:extent cx="6300372" cy="4664894"/>
             <wp:docPr id="10" name="Picture 10"/>
             <wp:cNvGraphicFramePr>
               <a:graphicFrameLocks noChangeAspect="1"/>
@@ -608,7 +608,7 @@
                   <pic:spPr>
                     <a:xfrm>
                       <a:off x="0" y="0"/>
-                      <a:ext cx="7186284" cy="4665139"/>
+                      <a:ext cx="6300372" cy="4664894"/>
                     </a:xfrm>
                     <a:prstGeom prst="rect"/>
                   </pic:spPr>
@@ -651,7 +651,7 @@
       <w:r>
         <w:drawing>
           <wp:inline xmlns:a="http://schemas.openxmlformats.org/drawingml/2006/main" xmlns:pic="http://schemas.openxmlformats.org/drawingml/2006/picture">
-            <wp:extent cx="5943600" cy="4449134"/>
+            <wp:extent cx="6335468" cy="4664656"/>
             <wp:docPr id="11" name="Picture 11"/>
             <wp:cNvGraphicFramePr>
               <a:graphicFrameLocks noChangeAspect="1"/>
@@ -672,7 +672,7 @@
                   <pic:spPr>
                     <a:xfrm>
                       <a:off x="0" y="0"/>
-                      <a:ext cx="5943600" cy="4449134"/>
+                      <a:ext cx="6335468" cy="4664656"/>
                     </a:xfrm>
                     <a:prstGeom prst="rect"/>
                   </pic:spPr>
@@ -699,7 +699,7 @@
     <w:p>
       <w:pPr>
         <w:sectPr>
-          <w:pgSz w:w="12240" w:h="15840"/>
+          <w:pgSz w:w="15840" w:h="12240" w:orient="landscape"/>
           <w:pgMar w:top="1440" w:right="1440" w:bottom="1440" w:left="1440" w:header="720" w:footer="720" w:gutter="0"/>
           <w:cols w:space="720"/>
           <w:docGrid w:linePitch="360"/>
@@ -779,7 +779,7 @@
       <w:r>
         <w:drawing>
           <wp:inline xmlns:a="http://schemas.openxmlformats.org/drawingml/2006/main" xmlns:pic="http://schemas.openxmlformats.org/drawingml/2006/picture">
-            <wp:extent cx="8165592" cy="3473942"/>
+            <wp:extent cx="8229600" cy="3695833"/>
             <wp:docPr id="13" name="Picture 13"/>
             <wp:cNvGraphicFramePr>
               <a:graphicFrameLocks noChangeAspect="1"/>
@@ -800,7 +800,7 @@
                   <pic:spPr>
                     <a:xfrm>
                       <a:off x="0" y="0"/>
-                      <a:ext cx="8165592" cy="3473942"/>
+                      <a:ext cx="8229600" cy="3695833"/>
                     </a:xfrm>
                     <a:prstGeom prst="rect"/>
                   </pic:spPr>

</xml_diff>

<commit_message>
Add descriptions to the DFD figures
One description per figure (and per Level 0 part), written from the
current diagrams' processes, flows and data stores.

Co-Authored-By: Claude Opus 5.5 <noreply@anthropic.com>
Claude-Session: https://claude.ai/code/session_0197sgxmB7VL2gdQVtM7kWoL
</commit_message>
<xml_diff>
--- a/docs/CobraByte_Context_Diagram_and_DFD.docx
+++ b/docs/CobraByte_Context_Diagram_and_DFD.docx
@@ -54,6 +54,36 @@
       </w:r>
       <w:r>
         <w:t>Context Diagram of CobraByte</w:t>
+      </w:r>
+    </w:p>
+    <w:p>
+      <w:pPr>
+        <w:spacing w:before="0" w:after="0" w:line="480" w:lineRule="auto"/>
+        <w:ind w:firstLine="720"/>
+        <w:jc w:val="both"/>
+      </w:pPr>
+      <w:r>
+        <w:t>This Context Diagram shows CobraByte: Learn Python the Interactive Way as a single process (0) and the data it exchanges with its three external entities: the Admin, the Mentor and the Learner.</w:t>
+      </w:r>
+    </w:p>
+    <w:p>
+      <w:pPr>
+        <w:spacing w:before="0" w:after="0" w:line="480" w:lineRule="auto"/>
+        <w:ind w:firstLine="720"/>
+        <w:jc w:val="both"/>
+      </w:pPr>
+      <w:r>
+        <w:t>The Learner sends "Registration Details", the "Verification Code", "Login Credentials", "Answers and Code" and "Profile Changes" into the system. In return, the system provides the Learner with the "Verification Code", "System Access", "Lessons and Activities", "Results and Feedback", and their "Badges and Certificate".</w:t>
+      </w:r>
+    </w:p>
+    <w:p>
+      <w:pPr>
+        <w:spacing w:before="0" w:after="0" w:line="480" w:lineRule="auto"/>
+        <w:ind w:firstLine="720"/>
+        <w:jc w:val="both"/>
+      </w:pPr>
+      <w:r>
+        <w:t>The Mentor sends "Login Credentials", "Course Content", "Activities and Exercises", the "Publishing Decision" and "Badge Details", and receives "System Access", a "Content Preview" and the "Learner Progress Report". The Admin sends "Staff Account Details", "Login Credentials", "Timer Settings" and an "Account Action", and receives the "Account Details", "System Access", the "Learner Progress Report" and the "System Report".</w:t>
       </w:r>
     </w:p>
     <w:p>
@@ -122,6 +152,36 @@
     </w:p>
     <w:p>
       <w:pPr>
+        <w:spacing w:before="0" w:after="0" w:line="480" w:lineRule="auto"/>
+        <w:ind w:firstLine="720"/>
+        <w:jc w:val="both"/>
+      </w:pPr>
+      <w:r>
+        <w:t>This Level 0 Data Flow Diagram breaks CobraByte into its nine major processes. Because the diagram is large, it is shown in three parts; this part covers processes 1.0 to 5.0. A data store used by more than one process is drawn next to each of them and is marked with a second line in its ID strip.</w:t>
+      </w:r>
+    </w:p>
+    <w:p>
+      <w:pPr>
+        <w:spacing w:before="0" w:after="0" w:line="480" w:lineRule="auto"/>
+        <w:ind w:firstLine="720"/>
+        <w:jc w:val="both"/>
+      </w:pPr>
+      <w:r>
+        <w:t>Register Account (1.0) checks the Learner's "Registration Details" against the "Account Records" in Accounts (D1), sends a "Verification Code", and saves the "Account Record". The Admin uses the same process to create staff accounts with the "Staff Account Details" and receives the "Account Details". Authenticate User (2.0) checks the "Login Credentials" of every user against Accounts (D1), saves the "Login Status", a "Login Record" in Login Logs (D2) and a "Session Record" in Sessions (D3), and returns "System Access".</w:t>
+      </w:r>
+    </w:p>
+    <w:p>
+      <w:pPr>
+        <w:spacing w:before="0" w:after="0" w:line="480" w:lineRule="auto"/>
+        <w:ind w:firstLine="720"/>
+        <w:jc w:val="both"/>
+      </w:pPr>
+      <w:r>
+        <w:t>The Mentor builds the course through Manage Course Content (3.0), which saves the chapter, module, lesson and video records in Chapters (D4), Modules (D5), Lessons (D6) and Video Tutorials (D7). Manage Learning Activities (4.0) saves the Mentor's "Activities and Exercises" in Learning Activities (D8) and Coding Exercises (D9), and the Admin's "Timer Settings" in Game Settings (D10). Publish Content (5.0) reads the lesson, activity and exercise content, gives the Mentor a "Content Preview", and saves the "Publishing Status" of each item according to the Mentor's "Publishing Decision".</w:t>
+      </w:r>
+    </w:p>
+    <w:p>
+      <w:pPr>
         <w:sectPr>
           <w:pgSz w:w="12240" w:h="15840"/>
           <w:pgMar w:top="1440" w:right="1440" w:bottom="1440" w:left="1440" w:header="720" w:footer="720" w:gutter="0"/>
@@ -182,6 +242,26 @@
       </w:r>
       <w:r>
         <w:t>Data Flow Diagram Level 0 (Part 2 of 3: 6.0 to 7.0)</w:t>
+      </w:r>
+    </w:p>
+    <w:p>
+      <w:pPr>
+        <w:spacing w:before="0" w:after="0" w:line="480" w:lineRule="auto"/>
+        <w:ind w:firstLine="720"/>
+        <w:jc w:val="both"/>
+      </w:pPr>
+      <w:r>
+        <w:t>This part of the Level 0 Data Flow Diagram covers processes 6.0 and 7.0. Deliver Lessons and Activities (6.0) reads the "Unlocked Lessons" from Learner Progress (D13) and the published lessons, videos, activities and exercises, together with the "Timer Settings" from Game Settings (D10), and gives the Learner the "Lessons and Activities". The Learner's "Answers and Code" are checked and returned as "Results and Feedback", while the "Answer Record", "Submission Record" and "Lesson Progress" are saved in Learner Answers (D11), Exercise Submissions (D12) and Learner Progress (D13).</w:t>
+      </w:r>
+    </w:p>
+    <w:p>
+      <w:pPr>
+        <w:spacing w:before="0" w:after="0" w:line="480" w:lineRule="auto"/>
+        <w:ind w:firstLine="720"/>
+        <w:jc w:val="both"/>
+      </w:pPr>
+      <w:r>
+        <w:t>Track Progress and Rewards (7.0) reads the "Answer Record", "Submission Record" and "Lesson Progress" to save the "Unlocked Lessons", and compares missed items with the "Lesson Content" to save a "Recommendation Record" in Recommendations (D16). It checks the "Badge Rules" in Badges (D14), saves each "Earned Badge" and "Certificate Record" in Certificates (D15), and shows the Learner their "Results and Feedback" and "Badges and Certificate". The Mentor's "Badge Details" are saved as "Badge Rules".</w:t>
       </w:r>
     </w:p>
     <w:p>
@@ -250,6 +330,26 @@
     </w:p>
     <w:p>
       <w:pPr>
+        <w:spacing w:before="0" w:after="0" w:line="480" w:lineRule="auto"/>
+        <w:ind w:firstLine="720"/>
+        <w:jc w:val="both"/>
+      </w:pPr>
+      <w:r>
+        <w:t>This part of the Level 0 Data Flow Diagram covers processes 8.0 and 9.0. Manage Accounts (8.0) applies the Admin's "Account Action" to the "Account Records" in Accounts (D1), returns the "Account Details", saves the "Account Updates", and writes an "Audit Log Entry" in Audit Logs (D17). It also saves the Learner's "Profile Changes".</w:t>
+      </w:r>
+    </w:p>
+    <w:p>
+      <w:pPr>
+        <w:spacing w:before="0" w:after="0" w:line="480" w:lineRule="auto"/>
+        <w:ind w:firstLine="720"/>
+        <w:jc w:val="both"/>
+      </w:pPr>
+      <w:r>
+        <w:t>Generate Reports (9.0) reads the "Lesson Progress", "Answer Record" and "Recommendation Record" to produce the "Learner Progress Report" for the Mentor and the Admin. It also reads the "Account Records", "Login Record", "Certificate Record" and "Audit Log Entry" to produce the "System Report" for the Admin.</w:t>
+      </w:r>
+    </w:p>
+    <w:p>
+      <w:pPr>
         <w:sectPr>
           <w:pgSz w:w="15840" w:h="12240" w:orient="landscape"/>
           <w:pgMar w:top="1440" w:right="1440" w:bottom="1440" w:left="1440" w:header="720" w:footer="720" w:gutter="0"/>
@@ -310,6 +410,26 @@
       </w:r>
       <w:r>
         <w:t>Data Flow Diagram Level 1 - 1.0 Register Account</w:t>
+      </w:r>
+    </w:p>
+    <w:p>
+      <w:pPr>
+        <w:spacing w:before="0" w:after="0" w:line="480" w:lineRule="auto"/>
+        <w:ind w:firstLine="720"/>
+        <w:jc w:val="both"/>
+      </w:pPr>
+      <w:r>
+        <w:t>This Level 1 Data Flow Diagram breaks down Register Account (1.0). The process begins with Validate Registration (1.1), where the Learner submits their "Registration Details". These are checked against the "Account Records" in Accounts (D1) so that no email or username is used twice, and a "Verification Code" is sent to the Learner.</w:t>
+      </w:r>
+    </w:p>
+    <w:p>
+      <w:pPr>
+        <w:spacing w:before="0" w:after="0" w:line="480" w:lineRule="auto"/>
+        <w:ind w:firstLine="720"/>
+        <w:jc w:val="both"/>
+      </w:pPr>
+      <w:r>
+        <w:t>The "Validated Details" pass to Save Learner Account (1.2). Once the Learner enters the "Verification Code", the new "Account Record" is saved in Accounts (D1). Admin and Mentor accounts are created by the Admin through Create Staff Account (1.3), which checks the "Staff Account Details" against the "Account Records", saves the "Account Record", and returns the "Account Details".</w:t>
       </w:r>
     </w:p>
     <w:p>
@@ -378,6 +498,26 @@
     </w:p>
     <w:p>
       <w:pPr>
+        <w:spacing w:before="0" w:after="0" w:line="480" w:lineRule="auto"/>
+        <w:ind w:firstLine="720"/>
+        <w:jc w:val="both"/>
+      </w:pPr>
+      <w:r>
+        <w:t>This Level 1 Data Flow Diagram breaks down Authenticate User (2.0), which works the same way for the Learner, the Mentor and the Admin. In Verify Credentials (2.1), the user's "Login Credentials" are checked against the "Account Records" in Accounts (D1). The process saves the "Login Status", such as failed attempts and lockouts, and records each attempt as a "Login Record" in Login Logs (D2).</w:t>
+      </w:r>
+    </w:p>
+    <w:p>
+      <w:pPr>
+        <w:spacing w:before="0" w:after="0" w:line="480" w:lineRule="auto"/>
+        <w:ind w:firstLine="720"/>
+        <w:jc w:val="both"/>
+      </w:pPr>
+      <w:r>
+        <w:t>When the credentials are correct, the "Verified User" passes to Create Session (2.2), which saves a "Session Record" in Sessions (D3) and grants "System Access" to the user, opening the dashboard for their role.</w:t>
+      </w:r>
+    </w:p>
+    <w:p>
+      <w:pPr>
         <w:sectPr>
           <w:pgSz w:w="15840" w:h="12240" w:orient="landscape"/>
           <w:pgMar w:top="1440" w:right="1440" w:bottom="1440" w:left="1440" w:header="720" w:footer="720" w:gutter="0"/>
@@ -438,6 +578,26 @@
       </w:r>
       <w:r>
         <w:t>Data Flow Diagram Level 1 - 3.0 Manage Course Content</w:t>
+      </w:r>
+    </w:p>
+    <w:p>
+      <w:pPr>
+        <w:spacing w:before="0" w:after="0" w:line="480" w:lineRule="auto"/>
+        <w:ind w:firstLine="720"/>
+        <w:jc w:val="both"/>
+      </w:pPr>
+      <w:r>
+        <w:t>This Level 1 Data Flow Diagram breaks down Manage Course Content (3.0), where the Mentor builds the structure of the course. Add Chapter (3.1) saves the "Chapter Details" as a "Chapter Record" in Chapters (D4). Add Module (3.2) uses the "Chapter List" to place the "Module Details" under a chapter and saves the "Module Record" in Modules (D5).</w:t>
+      </w:r>
+    </w:p>
+    <w:p>
+      <w:pPr>
+        <w:spacing w:before="0" w:after="0" w:line="480" w:lineRule="auto"/>
+        <w:ind w:firstLine="720"/>
+        <w:jc w:val="both"/>
+      </w:pPr>
+      <w:r>
+        <w:t>Add Lesson (3.3) uses the "Module List" to place the "Lesson Details" under a module and saves the "Lesson Record" in Lessons (D6). Finally, Attach Video Tutorial (3.4) links the Mentor's "Video Link" to a lesson from the "Lesson List" and saves the "Video Record" in Video Tutorials (D7).</w:t>
       </w:r>
     </w:p>
     <w:p>
@@ -506,6 +666,26 @@
     </w:p>
     <w:p>
       <w:pPr>
+        <w:spacing w:before="0" w:after="0" w:line="480" w:lineRule="auto"/>
+        <w:ind w:firstLine="720"/>
+        <w:jc w:val="both"/>
+      </w:pPr>
+      <w:r>
+        <w:t>This Level 1 Data Flow Diagram breaks down Manage Learning Activities (4.0). In Create Activity (4.1), the Mentor enters the "Activity Details" for a lesson chosen from the "Lesson List" in Lessons (D6), and the "Activity Record" is saved in Learning Activities (D8). The "New Activity" passes to Add Question Items (4.2), where the Mentor adds the "Question Items" for Multiple Choice, Fill in the Blanks or Flashcards, saved with the "Activity Record".</w:t>
+      </w:r>
+    </w:p>
+    <w:p>
+      <w:pPr>
+        <w:spacing w:before="0" w:after="0" w:line="480" w:lineRule="auto"/>
+        <w:ind w:firstLine="720"/>
+        <w:jc w:val="both"/>
+      </w:pPr>
+      <w:r>
+        <w:t>Create Coding Exercise (4.3) saves the Mentor's "Exercise Details" for a lesson as an "Exercise Record" in Coding Exercises (D9). In Set Question Timer (4.4), the Admin enters the "Timer Settings", the time allowed for each question, which are saved in Game Settings (D10).</w:t>
+      </w:r>
+    </w:p>
+    <w:p>
+      <w:pPr>
         <w:sectPr>
           <w:pgSz w:w="15840" w:h="12240" w:orient="landscape"/>
           <w:pgMar w:top="1440" w:right="1440" w:bottom="1440" w:left="1440" w:header="720" w:footer="720" w:gutter="0"/>
@@ -566,6 +746,26 @@
       </w:r>
       <w:r>
         <w:t>Data Flow Diagram Level 1 - 5.0 Publish Content</w:t>
+      </w:r>
+    </w:p>
+    <w:p>
+      <w:pPr>
+        <w:spacing w:before="0" w:after="0" w:line="480" w:lineRule="auto"/>
+        <w:ind w:firstLine="720"/>
+        <w:jc w:val="both"/>
+      </w:pPr>
+      <w:r>
+        <w:t>This Level 1 Data Flow Diagram breaks down Publish Content (5.0). In Review Content (5.1), the system reads the "Lesson Content", "Activity Content" and "Exercise Content" from Lessons (D6), Learning Activities (D8) and Coding Exercises (D9), and shows the Mentor a "Content Preview" of how learners will see it.</w:t>
+      </w:r>
+    </w:p>
+    <w:p>
+      <w:pPr>
+        <w:spacing w:before="0" w:after="0" w:line="480" w:lineRule="auto"/>
+        <w:ind w:firstLine="720"/>
+        <w:jc w:val="both"/>
+      </w:pPr>
+      <w:r>
+        <w:t>Based on the Mentor's "Publishing Decision", the "Approved Content" passes to Update Publish Status (5.2), which saves the "Publishing Status" of each item in its data store. Only published content is shown to learners.</w:t>
       </w:r>
     </w:p>
     <w:p>
@@ -634,6 +834,36 @@
     </w:p>
     <w:p>
       <w:pPr>
+        <w:spacing w:before="0" w:after="0" w:line="480" w:lineRule="auto"/>
+        <w:ind w:firstLine="720"/>
+        <w:jc w:val="both"/>
+      </w:pPr>
+      <w:r>
+        <w:t>This Level 1 Data Flow Diagram breaks down Deliver Lessons and Activities (6.0). Display Lesson (6.1) reads the Learner's "Unlocked Lessons" from Learner Progress (D13), the "Published Lessons" from Lessons (D6) and the "Video Link" from Video Tutorials (D7), shows the Learner the "Lesson Content", and saves the "Lesson Progress".</w:t>
+      </w:r>
+    </w:p>
+    <w:p>
+      <w:pPr>
+        <w:spacing w:before="0" w:after="0" w:line="480" w:lineRule="auto"/>
+        <w:ind w:firstLine="720"/>
+        <w:jc w:val="both"/>
+      </w:pPr>
+      <w:r>
+        <w:t>Check Activity Answers (6.2) reads the "Published Activities" from Learning Activities (D8) and the "Timer Settings" from Game Settings (D10), and shows the Learner the "Activity Questions". The Learner's "Activity Answers" are checked and returned as "Answer Feedback", and the "Answer Record" and "Lesson Progress" are saved in Learner Answers (D11) and Learner Progress (D13).</w:t>
+      </w:r>
+    </w:p>
+    <w:p>
+      <w:pPr>
+        <w:spacing w:before="0" w:after="0" w:line="480" w:lineRule="auto"/>
+        <w:ind w:firstLine="720"/>
+        <w:jc w:val="both"/>
+      </w:pPr>
+      <w:r>
+        <w:t>Check Exercise Code (6.3) checks the Learner's "Exercise Code" against the "Published Exercises" in Coding Exercises (D9), returns the "Exercise Result", and saves the "Submission Record" in Exercise Submissions (D12) and the "Lesson Progress".</w:t>
+      </w:r>
+    </w:p>
+    <w:p>
+      <w:pPr>
         <w:sectPr>
           <w:pgSz w:w="15840" w:h="12240" w:orient="landscape"/>
           <w:pgMar w:top="1440" w:right="1440" w:bottom="1440" w:left="1440" w:header="720" w:footer="720" w:gutter="0"/>
@@ -694,6 +924,26 @@
       </w:r>
       <w:r>
         <w:t>Data Flow Diagram Level 1 - 7.0 Track Progress and Rewards</w:t>
+      </w:r>
+    </w:p>
+    <w:p>
+      <w:pPr>
+        <w:spacing w:before="0" w:after="0" w:line="480" w:lineRule="auto"/>
+        <w:ind w:firstLine="720"/>
+        <w:jc w:val="both"/>
+      </w:pPr>
+      <w:r>
+        <w:t>This Level 1 Data Flow Diagram breaks down Track Progress and Rewards (7.0). Compute Lesson Score (7.1) reads the "Answer Record" from Learner Answers (D11) and the "Submission Record" from Exercise Submissions (D12), and passes the "Lesson Score" to Check Module Pass (7.2). Using the "Lesson Progress" from Learner Progress (D13), a module passes when all its lessons are completed with an average of at least 80%, and the next "Unlocked Lessons" are saved.</w:t>
+      </w:r>
+    </w:p>
+    <w:p>
+      <w:pPr>
+        <w:spacing w:before="0" w:after="0" w:line="480" w:lineRule="auto"/>
+        <w:ind w:firstLine="720"/>
+        <w:jc w:val="both"/>
+      </w:pPr>
+      <w:r>
+        <w:t>The "Missed Items" pass to Find Weak Spots (7.3), which matches them with the "Lesson Content" in Lessons (D6), saves a "Recommendation Record" in Recommendations (D16), and gives the Learner a "Weak Spot Review". The "Passed Modules" pass to Award Badges and Certificate (7.4), which compares them with the "Badge Rules" in Badges (D14), saves each "Earned Badge" and the "Certificate Record" in Certificates (D15), and shows the Learner their "Badges and Certificate". The Mentor creates badges through Define Badges (7.5), which saves the "Badge Details" as "Badge Rules".</w:t>
       </w:r>
     </w:p>
     <w:p>
@@ -762,6 +1012,26 @@
     </w:p>
     <w:p>
       <w:pPr>
+        <w:spacing w:before="0" w:after="0" w:line="480" w:lineRule="auto"/>
+        <w:ind w:firstLine="720"/>
+        <w:jc w:val="both"/>
+      </w:pPr>
+      <w:r>
+        <w:t>This Level 1 Data Flow Diagram breaks down Manage Accounts (8.0). In Update Account Status (8.1), the Admin sends an "Account Action", such as archiving, restoring or unlocking an account. The process reads the "Account Records" from Accounts (D1), returns the "Account Details", saves the "Account Updates", and writes an "Audit Log Entry" in Audit Logs (D17).</w:t>
+      </w:r>
+    </w:p>
+    <w:p>
+      <w:pPr>
+        <w:spacing w:before="0" w:after="0" w:line="480" w:lineRule="auto"/>
+        <w:ind w:firstLine="720"/>
+        <w:jc w:val="both"/>
+      </w:pPr>
+      <w:r>
+        <w:t>In Update Profile (8.2), the Learner's "Profile Changes" are checked against the "Account Records" and saved as "Account Updates" in Accounts (D1).</w:t>
+      </w:r>
+    </w:p>
+    <w:p>
+      <w:pPr>
         <w:sectPr>
           <w:pgSz w:w="15840" w:h="12240" w:orient="landscape"/>
           <w:pgMar w:top="1440" w:right="1440" w:bottom="1440" w:left="1440" w:header="720" w:footer="720" w:gutter="0"/>
@@ -822,6 +1092,26 @@
       </w:r>
       <w:r>
         <w:t>Data Flow Diagram Level 1 - 9.0 Generate Reports</w:t>
+      </w:r>
+    </w:p>
+    <w:p>
+      <w:pPr>
+        <w:spacing w:before="0" w:after="0" w:line="480" w:lineRule="auto"/>
+        <w:ind w:firstLine="720"/>
+        <w:jc w:val="both"/>
+      </w:pPr>
+      <w:r>
+        <w:t>This Level 1 Data Flow Diagram breaks down Generate Reports (9.0). Generate Progress Report (9.1) reads the "Lesson Progress" from Learner Progress (D13), the "Answer Record" from Learner Answers (D11) and the "Recommendation Record" from Recommendations (D16), and produces the "Learner Progress Report" for the Mentor and the Admin.</w:t>
+      </w:r>
+    </w:p>
+    <w:p>
+      <w:pPr>
+        <w:spacing w:before="0" w:after="0" w:line="480" w:lineRule="auto"/>
+        <w:ind w:firstLine="720"/>
+        <w:jc w:val="both"/>
+      </w:pPr>
+      <w:r>
+        <w:t>Generate System Report (9.2) reads the "Account Records" from Accounts (D1), the "Login Record" from Login Logs (D2), the "Certificate Record" from Certificates (D15) and the "Audit Log Entry" from Audit Logs (D17), and produces the "System Report" for the Admin.</w:t>
       </w:r>
     </w:p>
     <w:sectPr>

</xml_diff>